<commit_message>
docs: add thesis diagrams and use cases
</commit_message>
<xml_diff>
--- a/docs/TRABAJO_FINAL_corregido_TPScouting.docx
+++ b/docs/TRABAJO_FINAL_corregido_TPScouting.docx
@@ -23,7 +23,7 @@
           <w:szCs w:val="28"/>
         </w:rPr>
         <w:drawing>
-          <wp:anchor distT="0" distB="0" distL="114300" distR="114300" simplePos="0" relativeHeight="251658240" behindDoc="0" locked="0" layoutInCell="1" allowOverlap="1" wp14:anchorId="54E345B9" wp14:editId="2DF6A3E6">
+          <wp:anchor distT="0" distB="0" distL="114300" distR="114300" simplePos="0" relativeHeight="251658240" behindDoc="0" locked="0" layoutInCell="1" allowOverlap="1" wp14:anchorId="041972F6" wp14:editId="5F5BF645">
             <wp:simplePos x="0" y="0"/>
             <wp:positionH relativeFrom="margin">
               <wp:posOffset>805815</wp:posOffset>
@@ -457,7 +457,7 @@
       <w:r>
         <w:fldChar w:fldCharType="separate"/>
       </w:r>
-      <w:hyperlink w:anchor="_Toc230369134" w:history="1">
+      <w:hyperlink w:anchor="_Toc230376286" w:history="1">
         <w:r>
           <w:rPr>
             <w:rStyle w:val="Hipervnculo"/>
@@ -484,7 +484,7 @@
             <w:noProof/>
             <w:webHidden/>
           </w:rPr>
-          <w:instrText xml:space="preserve"> PAGEREF _Toc230369134 \h </w:instrText>
+          <w:instrText xml:space="preserve"> PAGEREF _Toc230376286 \h </w:instrText>
         </w:r>
         <w:r>
           <w:rPr>
@@ -528,7 +528,7 @@
           <w:lang w:val="es-AR" w:eastAsia="es-AR"/>
         </w:rPr>
       </w:pPr>
-      <w:hyperlink w:anchor="_Toc230369135" w:history="1">
+      <w:hyperlink w:anchor="_Toc230376287" w:history="1">
         <w:r>
           <w:rPr>
             <w:rStyle w:val="Hipervnculo"/>
@@ -555,7 +555,7 @@
             <w:noProof/>
             <w:webHidden/>
           </w:rPr>
-          <w:instrText xml:space="preserve"> PAGEREF _Toc230369135 \h </w:instrText>
+          <w:instrText xml:space="preserve"> PAGEREF _Toc230376287 \h </w:instrText>
         </w:r>
         <w:r>
           <w:rPr>
@@ -575,7 +575,7 @@
             <w:noProof/>
             <w:webHidden/>
           </w:rPr>
-          <w:t>5</w:t>
+          <w:t>6</w:t>
         </w:r>
         <w:r>
           <w:rPr>
@@ -599,7 +599,7 @@
           <w:lang w:val="es-AR" w:eastAsia="es-AR"/>
         </w:rPr>
       </w:pPr>
-      <w:hyperlink w:anchor="_Toc230369136" w:history="1">
+      <w:hyperlink w:anchor="_Toc230376288" w:history="1">
         <w:r>
           <w:rPr>
             <w:rStyle w:val="Hipervnculo"/>
@@ -626,7 +626,7 @@
             <w:noProof/>
             <w:webHidden/>
           </w:rPr>
-          <w:instrText xml:space="preserve"> PAGEREF _Toc230369136 \h </w:instrText>
+          <w:instrText xml:space="preserve"> PAGEREF _Toc230376288 \h </w:instrText>
         </w:r>
         <w:r>
           <w:rPr>
@@ -670,7 +670,7 @@
           <w:lang w:val="es-AR" w:eastAsia="es-AR"/>
         </w:rPr>
       </w:pPr>
-      <w:hyperlink w:anchor="_Toc230369137" w:history="1">
+      <w:hyperlink w:anchor="_Toc230376289" w:history="1">
         <w:r>
           <w:rPr>
             <w:rStyle w:val="Hipervnculo"/>
@@ -699,7 +699,7 @@
             <w:noProof/>
             <w:webHidden/>
           </w:rPr>
-          <w:instrText xml:space="preserve"> PAGEREF _Toc230369137 \h </w:instrText>
+          <w:instrText xml:space="preserve"> PAGEREF _Toc230376289 \h </w:instrText>
         </w:r>
         <w:r>
           <w:rPr>
@@ -743,7 +743,7 @@
           <w:lang w:val="es-AR" w:eastAsia="es-AR"/>
         </w:rPr>
       </w:pPr>
-      <w:hyperlink w:anchor="_Toc230369138" w:history="1">
+      <w:hyperlink w:anchor="_Toc230376290" w:history="1">
         <w:r>
           <w:rPr>
             <w:rStyle w:val="Hipervnculo"/>
@@ -772,7 +772,7 @@
             <w:noProof/>
             <w:webHidden/>
           </w:rPr>
-          <w:instrText xml:space="preserve"> PAGEREF _Toc230369138 \h </w:instrText>
+          <w:instrText xml:space="preserve"> PAGEREF _Toc230376290 \h </w:instrText>
         </w:r>
         <w:r>
           <w:rPr>
@@ -816,7 +816,7 @@
           <w:lang w:val="es-AR" w:eastAsia="es-AR"/>
         </w:rPr>
       </w:pPr>
-      <w:hyperlink w:anchor="_Toc230369139" w:history="1">
+      <w:hyperlink w:anchor="_Toc230376291" w:history="1">
         <w:r>
           <w:rPr>
             <w:rStyle w:val="Hipervnculo"/>
@@ -845,7 +845,7 @@
             <w:noProof/>
             <w:webHidden/>
           </w:rPr>
-          <w:instrText xml:space="preserve"> PAGEREF _Toc230369139 \h </w:instrText>
+          <w:instrText xml:space="preserve"> PAGEREF _Toc230376291 \h </w:instrText>
         </w:r>
         <w:r>
           <w:rPr>
@@ -889,7 +889,7 @@
           <w:lang w:val="es-AR" w:eastAsia="es-AR"/>
         </w:rPr>
       </w:pPr>
-      <w:hyperlink w:anchor="_Toc230369140" w:history="1">
+      <w:hyperlink w:anchor="_Toc230376292" w:history="1">
         <w:r>
           <w:rPr>
             <w:rStyle w:val="Hipervnculo"/>
@@ -918,7 +918,7 @@
             <w:noProof/>
             <w:webHidden/>
           </w:rPr>
-          <w:instrText xml:space="preserve"> PAGEREF _Toc230369140 \h </w:instrText>
+          <w:instrText xml:space="preserve"> PAGEREF _Toc230376292 \h </w:instrText>
         </w:r>
         <w:r>
           <w:rPr>
@@ -962,7 +962,7 @@
           <w:lang w:val="es-AR" w:eastAsia="es-AR"/>
         </w:rPr>
       </w:pPr>
-      <w:hyperlink w:anchor="_Toc230369141" w:history="1">
+      <w:hyperlink w:anchor="_Toc230376293" w:history="1">
         <w:r>
           <w:rPr>
             <w:rStyle w:val="Hipervnculo"/>
@@ -991,7 +991,7 @@
             <w:noProof/>
             <w:webHidden/>
           </w:rPr>
-          <w:instrText xml:space="preserve"> PAGEREF _Toc230369141 \h </w:instrText>
+          <w:instrText xml:space="preserve"> PAGEREF _Toc230376293 \h </w:instrText>
         </w:r>
         <w:r>
           <w:rPr>
@@ -1035,7 +1035,7 @@
           <w:lang w:val="es-AR" w:eastAsia="es-AR"/>
         </w:rPr>
       </w:pPr>
-      <w:hyperlink w:anchor="_Toc230369142" w:history="1">
+      <w:hyperlink w:anchor="_Toc230376294" w:history="1">
         <w:r>
           <w:rPr>
             <w:rStyle w:val="Hipervnculo"/>
@@ -1064,7 +1064,7 @@
             <w:noProof/>
             <w:webHidden/>
           </w:rPr>
-          <w:instrText xml:space="preserve"> PAGEREF _Toc230369142 \h </w:instrText>
+          <w:instrText xml:space="preserve"> PAGEREF _Toc230376294 \h </w:instrText>
         </w:r>
         <w:r>
           <w:rPr>
@@ -1108,7 +1108,7 @@
           <w:lang w:val="es-AR" w:eastAsia="es-AR"/>
         </w:rPr>
       </w:pPr>
-      <w:hyperlink w:anchor="_Toc230369143" w:history="1">
+      <w:hyperlink w:anchor="_Toc230376295" w:history="1">
         <w:r>
           <w:rPr>
             <w:rStyle w:val="Hipervnculo"/>
@@ -1137,7 +1137,7 @@
             <w:noProof/>
             <w:webHidden/>
           </w:rPr>
-          <w:instrText xml:space="preserve"> PAGEREF _Toc230369143 \h </w:instrText>
+          <w:instrText xml:space="preserve"> PAGEREF _Toc230376295 \h </w:instrText>
         </w:r>
         <w:r>
           <w:rPr>
@@ -1181,7 +1181,7 @@
           <w:lang w:val="es-AR" w:eastAsia="es-AR"/>
         </w:rPr>
       </w:pPr>
-      <w:hyperlink w:anchor="_Toc230369144" w:history="1">
+      <w:hyperlink w:anchor="_Toc230376296" w:history="1">
         <w:r>
           <w:rPr>
             <w:rStyle w:val="Hipervnculo"/>
@@ -1210,7 +1210,7 @@
             <w:noProof/>
             <w:webHidden/>
           </w:rPr>
-          <w:instrText xml:space="preserve"> PAGEREF _Toc230369144 \h </w:instrText>
+          <w:instrText xml:space="preserve"> PAGEREF _Toc230376296 \h </w:instrText>
         </w:r>
         <w:r>
           <w:rPr>
@@ -1254,7 +1254,7 @@
           <w:lang w:val="es-AR" w:eastAsia="es-AR"/>
         </w:rPr>
       </w:pPr>
-      <w:hyperlink w:anchor="_Toc230369145" w:history="1">
+      <w:hyperlink w:anchor="_Toc230376297" w:history="1">
         <w:r>
           <w:rPr>
             <w:rStyle w:val="Hipervnculo"/>
@@ -1283,7 +1283,7 @@
             <w:noProof/>
             <w:webHidden/>
           </w:rPr>
-          <w:instrText xml:space="preserve"> PAGEREF _Toc230369145 \h </w:instrText>
+          <w:instrText xml:space="preserve"> PAGEREF _Toc230376297 \h </w:instrText>
         </w:r>
         <w:r>
           <w:rPr>
@@ -1327,7 +1327,7 @@
           <w:lang w:val="es-AR" w:eastAsia="es-AR"/>
         </w:rPr>
       </w:pPr>
-      <w:hyperlink w:anchor="_Toc230369146" w:history="1">
+      <w:hyperlink w:anchor="_Toc230376298" w:history="1">
         <w:r>
           <w:rPr>
             <w:rStyle w:val="Hipervnculo"/>
@@ -1356,7 +1356,7 @@
             <w:noProof/>
             <w:webHidden/>
           </w:rPr>
-          <w:instrText xml:space="preserve"> PAGEREF _Toc230369146 \h </w:instrText>
+          <w:instrText xml:space="preserve"> PAGEREF _Toc230376298 \h </w:instrText>
         </w:r>
         <w:r>
           <w:rPr>
@@ -1400,7 +1400,7 @@
           <w:lang w:val="es-AR" w:eastAsia="es-AR"/>
         </w:rPr>
       </w:pPr>
-      <w:hyperlink w:anchor="_Toc230369147" w:history="1">
+      <w:hyperlink w:anchor="_Toc230376299" w:history="1">
         <w:r>
           <w:rPr>
             <w:rStyle w:val="Hipervnculo"/>
@@ -1429,7 +1429,7 @@
             <w:noProof/>
             <w:webHidden/>
           </w:rPr>
-          <w:instrText xml:space="preserve"> PAGEREF _Toc230369147 \h </w:instrText>
+          <w:instrText xml:space="preserve"> PAGEREF _Toc230376299 \h </w:instrText>
         </w:r>
         <w:r>
           <w:rPr>
@@ -1473,7 +1473,7 @@
           <w:lang w:val="es-AR" w:eastAsia="es-AR"/>
         </w:rPr>
       </w:pPr>
-      <w:hyperlink w:anchor="_Toc230369148" w:history="1">
+      <w:hyperlink w:anchor="_Toc230376300" w:history="1">
         <w:r>
           <w:rPr>
             <w:rStyle w:val="Hipervnculo"/>
@@ -1502,7 +1502,7 @@
             <w:noProof/>
             <w:webHidden/>
           </w:rPr>
-          <w:instrText xml:space="preserve"> PAGEREF _Toc230369148 \h </w:instrText>
+          <w:instrText xml:space="preserve"> PAGEREF _Toc230376300 \h </w:instrText>
         </w:r>
         <w:r>
           <w:rPr>
@@ -1546,7 +1546,7 @@
           <w:lang w:val="es-AR" w:eastAsia="es-AR"/>
         </w:rPr>
       </w:pPr>
-      <w:hyperlink w:anchor="_Toc230369149" w:history="1">
+      <w:hyperlink w:anchor="_Toc230376301" w:history="1">
         <w:r>
           <w:rPr>
             <w:rStyle w:val="Hipervnculo"/>
@@ -1575,7 +1575,7 @@
             <w:noProof/>
             <w:webHidden/>
           </w:rPr>
-          <w:instrText xml:space="preserve"> PAGEREF _Toc230369149 \h </w:instrText>
+          <w:instrText xml:space="preserve"> PAGEREF _Toc230376301 \h </w:instrText>
         </w:r>
         <w:r>
           <w:rPr>
@@ -1619,7 +1619,7 @@
           <w:lang w:val="es-AR" w:eastAsia="es-AR"/>
         </w:rPr>
       </w:pPr>
-      <w:hyperlink w:anchor="_Toc230369150" w:history="1">
+      <w:hyperlink w:anchor="_Toc230376302" w:history="1">
         <w:r>
           <w:rPr>
             <w:rStyle w:val="Hipervnculo"/>
@@ -1647,7 +1647,7 @@
             <w:noProof/>
             <w:webHidden/>
           </w:rPr>
-          <w:instrText xml:space="preserve"> PAGEREF _Toc230369150 \h </w:instrText>
+          <w:instrText xml:space="preserve"> PAGEREF _Toc230376302 \h </w:instrText>
         </w:r>
         <w:r>
           <w:rPr>
@@ -1691,7 +1691,7 @@
           <w:lang w:val="es-AR" w:eastAsia="es-AR"/>
         </w:rPr>
       </w:pPr>
-      <w:hyperlink w:anchor="_Toc230369151" w:history="1">
+      <w:hyperlink w:anchor="_Toc230376303" w:history="1">
         <w:r>
           <w:rPr>
             <w:rStyle w:val="Hipervnculo"/>
@@ -1719,7 +1719,7 @@
             <w:noProof/>
             <w:webHidden/>
           </w:rPr>
-          <w:instrText xml:space="preserve"> PAGEREF _Toc230369151 \h </w:instrText>
+          <w:instrText xml:space="preserve"> PAGEREF _Toc230376303 \h </w:instrText>
         </w:r>
         <w:r>
           <w:rPr>
@@ -1763,7 +1763,7 @@
           <w:lang w:val="es-AR" w:eastAsia="es-AR"/>
         </w:rPr>
       </w:pPr>
-      <w:hyperlink w:anchor="_Toc230369152" w:history="1">
+      <w:hyperlink w:anchor="_Toc230376304" w:history="1">
         <w:r>
           <w:rPr>
             <w:rStyle w:val="Hipervnculo"/>
@@ -1792,7 +1792,7 @@
             <w:noProof/>
             <w:webHidden/>
           </w:rPr>
-          <w:instrText xml:space="preserve"> PAGEREF _Toc230369152 \h </w:instrText>
+          <w:instrText xml:space="preserve"> PAGEREF _Toc230376304 \h </w:instrText>
         </w:r>
         <w:r>
           <w:rPr>
@@ -1836,7 +1836,7 @@
           <w:lang w:val="es-AR" w:eastAsia="es-AR"/>
         </w:rPr>
       </w:pPr>
-      <w:hyperlink w:anchor="_Toc230369153" w:history="1">
+      <w:hyperlink w:anchor="_Toc230376305" w:history="1">
         <w:r>
           <w:rPr>
             <w:rStyle w:val="Hipervnculo"/>
@@ -1865,7 +1865,7 @@
             <w:noProof/>
             <w:webHidden/>
           </w:rPr>
-          <w:instrText xml:space="preserve"> PAGEREF _Toc230369153 \h </w:instrText>
+          <w:instrText xml:space="preserve"> PAGEREF _Toc230376305 \h </w:instrText>
         </w:r>
         <w:r>
           <w:rPr>
@@ -1909,7 +1909,7 @@
           <w:lang w:val="es-AR" w:eastAsia="es-AR"/>
         </w:rPr>
       </w:pPr>
-      <w:hyperlink w:anchor="_Toc230369154" w:history="1">
+      <w:hyperlink w:anchor="_Toc230376306" w:history="1">
         <w:r>
           <w:rPr>
             <w:rStyle w:val="Hipervnculo"/>
@@ -1936,7 +1936,7 @@
             <w:noProof/>
             <w:webHidden/>
           </w:rPr>
-          <w:instrText xml:space="preserve"> PAGEREF _Toc230369154 \h </w:instrText>
+          <w:instrText xml:space="preserve"> PAGEREF _Toc230376306 \h </w:instrText>
         </w:r>
         <w:r>
           <w:rPr>
@@ -1980,7 +1980,7 @@
           <w:lang w:val="es-AR" w:eastAsia="es-AR"/>
         </w:rPr>
       </w:pPr>
-      <w:hyperlink w:anchor="_Toc230369155" w:history="1">
+      <w:hyperlink w:anchor="_Toc230376307" w:history="1">
         <w:r>
           <w:rPr>
             <w:rStyle w:val="Hipervnculo"/>
@@ -2009,7 +2009,7 @@
             <w:noProof/>
             <w:webHidden/>
           </w:rPr>
-          <w:instrText xml:space="preserve"> PAGEREF _Toc230369155 \h </w:instrText>
+          <w:instrText xml:space="preserve"> PAGEREF _Toc230376307 \h </w:instrText>
         </w:r>
         <w:r>
           <w:rPr>
@@ -2053,7 +2053,7 @@
           <w:lang w:val="es-AR" w:eastAsia="es-AR"/>
         </w:rPr>
       </w:pPr>
-      <w:hyperlink w:anchor="_Toc230369156" w:history="1">
+      <w:hyperlink w:anchor="_Toc230376308" w:history="1">
         <w:r>
           <w:rPr>
             <w:rStyle w:val="Hipervnculo"/>
@@ -2080,7 +2080,7 @@
             <w:noProof/>
             <w:webHidden/>
           </w:rPr>
-          <w:instrText xml:space="preserve"> PAGEREF _Toc230369156 \h </w:instrText>
+          <w:instrText xml:space="preserve"> PAGEREF _Toc230376308 \h </w:instrText>
         </w:r>
         <w:r>
           <w:rPr>
@@ -2124,7 +2124,7 @@
           <w:lang w:val="es-AR" w:eastAsia="es-AR"/>
         </w:rPr>
       </w:pPr>
-      <w:hyperlink w:anchor="_Toc230369157" w:history="1">
+      <w:hyperlink w:anchor="_Toc230376309" w:history="1">
         <w:r>
           <w:rPr>
             <w:rStyle w:val="Hipervnculo"/>
@@ -2151,7 +2151,7 @@
             <w:noProof/>
             <w:webHidden/>
           </w:rPr>
-          <w:instrText xml:space="preserve"> PAGEREF _Toc230369157 \h </w:instrText>
+          <w:instrText xml:space="preserve"> PAGEREF _Toc230376309 \h </w:instrText>
         </w:r>
         <w:r>
           <w:rPr>
@@ -2195,7 +2195,7 @@
           <w:lang w:val="es-AR" w:eastAsia="es-AR"/>
         </w:rPr>
       </w:pPr>
-      <w:hyperlink w:anchor="_Toc230369158" w:history="1">
+      <w:hyperlink w:anchor="_Toc230376310" w:history="1">
         <w:r>
           <w:rPr>
             <w:rStyle w:val="Hipervnculo"/>
@@ -2222,7 +2222,7 @@
             <w:noProof/>
             <w:webHidden/>
           </w:rPr>
-          <w:instrText xml:space="preserve"> PAGEREF _Toc230369158 \h </w:instrText>
+          <w:instrText xml:space="preserve"> PAGEREF _Toc230376310 \h </w:instrText>
         </w:r>
         <w:r>
           <w:rPr>
@@ -2266,7 +2266,7 @@
           <w:lang w:val="es-AR" w:eastAsia="es-AR"/>
         </w:rPr>
       </w:pPr>
-      <w:hyperlink w:anchor="_Toc230369159" w:history="1">
+      <w:hyperlink w:anchor="_Toc230376311" w:history="1">
         <w:r>
           <w:rPr>
             <w:rStyle w:val="Hipervnculo"/>
@@ -2293,7 +2293,7 @@
             <w:noProof/>
             <w:webHidden/>
           </w:rPr>
-          <w:instrText xml:space="preserve"> PAGEREF _Toc230369159 \h </w:instrText>
+          <w:instrText xml:space="preserve"> PAGEREF _Toc230376311 \h </w:instrText>
         </w:r>
         <w:r>
           <w:rPr>
@@ -2337,7 +2337,7 @@
           <w:lang w:val="es-AR" w:eastAsia="es-AR"/>
         </w:rPr>
       </w:pPr>
-      <w:hyperlink w:anchor="_Toc230369160" w:history="1">
+      <w:hyperlink w:anchor="_Toc230376312" w:history="1">
         <w:r>
           <w:rPr>
             <w:rStyle w:val="Hipervnculo"/>
@@ -2364,7 +2364,7 @@
             <w:noProof/>
             <w:webHidden/>
           </w:rPr>
-          <w:instrText xml:space="preserve"> PAGEREF _Toc230369160 \h </w:instrText>
+          <w:instrText xml:space="preserve"> PAGEREF _Toc230376312 \h </w:instrText>
         </w:r>
         <w:r>
           <w:rPr>
@@ -2408,7 +2408,7 @@
           <w:lang w:val="es-AR" w:eastAsia="es-AR"/>
         </w:rPr>
       </w:pPr>
-      <w:hyperlink w:anchor="_Toc230369161" w:history="1">
+      <w:hyperlink w:anchor="_Toc230376313" w:history="1">
         <w:r>
           <w:rPr>
             <w:rStyle w:val="Hipervnculo"/>
@@ -2435,7 +2435,7 @@
             <w:noProof/>
             <w:webHidden/>
           </w:rPr>
-          <w:instrText xml:space="preserve"> PAGEREF _Toc230369161 \h </w:instrText>
+          <w:instrText xml:space="preserve"> PAGEREF _Toc230376313 \h </w:instrText>
         </w:r>
         <w:r>
           <w:rPr>
@@ -2479,7 +2479,7 @@
           <w:lang w:val="es-AR" w:eastAsia="es-AR"/>
         </w:rPr>
       </w:pPr>
-      <w:hyperlink w:anchor="_Toc230369162" w:history="1">
+      <w:hyperlink w:anchor="_Toc230376314" w:history="1">
         <w:r>
           <w:rPr>
             <w:rStyle w:val="Hipervnculo"/>
@@ -2506,7 +2506,7 @@
             <w:noProof/>
             <w:webHidden/>
           </w:rPr>
-          <w:instrText xml:space="preserve"> PAGEREF _Toc230369162 \h </w:instrText>
+          <w:instrText xml:space="preserve"> PAGEREF _Toc230376314 \h </w:instrText>
         </w:r>
         <w:r>
           <w:rPr>
@@ -2550,7 +2550,7 @@
           <w:lang w:val="es-AR" w:eastAsia="es-AR"/>
         </w:rPr>
       </w:pPr>
-      <w:hyperlink w:anchor="_Toc230369163" w:history="1">
+      <w:hyperlink w:anchor="_Toc230376315" w:history="1">
         <w:r>
           <w:rPr>
             <w:rStyle w:val="Hipervnculo"/>
@@ -2579,7 +2579,7 @@
             <w:noProof/>
             <w:webHidden/>
           </w:rPr>
-          <w:instrText xml:space="preserve"> PAGEREF _Toc230369163 \h </w:instrText>
+          <w:instrText xml:space="preserve"> PAGEREF _Toc230376315 \h </w:instrText>
         </w:r>
         <w:r>
           <w:rPr>
@@ -2623,7 +2623,7 @@
           <w:lang w:val="es-AR" w:eastAsia="es-AR"/>
         </w:rPr>
       </w:pPr>
-      <w:hyperlink w:anchor="_Toc230369164" w:history="1">
+      <w:hyperlink w:anchor="_Toc230376316" w:history="1">
         <w:r>
           <w:rPr>
             <w:rStyle w:val="Hipervnculo"/>
@@ -2652,7 +2652,7 @@
             <w:noProof/>
             <w:webHidden/>
           </w:rPr>
-          <w:instrText xml:space="preserve"> PAGEREF _Toc230369164 \h </w:instrText>
+          <w:instrText xml:space="preserve"> PAGEREF _Toc230376316 \h </w:instrText>
         </w:r>
         <w:r>
           <w:rPr>
@@ -2696,7 +2696,7 @@
           <w:lang w:val="es-AR" w:eastAsia="es-AR"/>
         </w:rPr>
       </w:pPr>
-      <w:hyperlink w:anchor="_Toc230369165" w:history="1">
+      <w:hyperlink w:anchor="_Toc230376317" w:history="1">
         <w:r>
           <w:rPr>
             <w:rStyle w:val="Hipervnculo"/>
@@ -2725,7 +2725,7 @@
             <w:noProof/>
             <w:webHidden/>
           </w:rPr>
-          <w:instrText xml:space="preserve"> PAGEREF _Toc230369165 \h </w:instrText>
+          <w:instrText xml:space="preserve"> PAGEREF _Toc230376317 \h </w:instrText>
         </w:r>
         <w:r>
           <w:rPr>
@@ -2769,7 +2769,7 @@
           <w:lang w:val="es-AR" w:eastAsia="es-AR"/>
         </w:rPr>
       </w:pPr>
-      <w:hyperlink w:anchor="_Toc230369166" w:history="1">
+      <w:hyperlink w:anchor="_Toc230376318" w:history="1">
         <w:r>
           <w:rPr>
             <w:rStyle w:val="Hipervnculo"/>
@@ -2798,7 +2798,7 @@
             <w:noProof/>
             <w:webHidden/>
           </w:rPr>
-          <w:instrText xml:space="preserve"> PAGEREF _Toc230369166 \h </w:instrText>
+          <w:instrText xml:space="preserve"> PAGEREF _Toc230376318 \h </w:instrText>
         </w:r>
         <w:r>
           <w:rPr>
@@ -2842,7 +2842,7 @@
           <w:lang w:val="es-AR" w:eastAsia="es-AR"/>
         </w:rPr>
       </w:pPr>
-      <w:hyperlink w:anchor="_Toc230369167" w:history="1">
+      <w:hyperlink w:anchor="_Toc230376319" w:history="1">
         <w:r>
           <w:rPr>
             <w:rStyle w:val="Hipervnculo"/>
@@ -2871,7 +2871,7 @@
             <w:noProof/>
             <w:webHidden/>
           </w:rPr>
-          <w:instrText xml:space="preserve"> PAGEREF _Toc230369167 \h </w:instrText>
+          <w:instrText xml:space="preserve"> PAGEREF _Toc230376319 \h </w:instrText>
         </w:r>
         <w:r>
           <w:rPr>
@@ -2891,7 +2891,7 @@
             <w:noProof/>
             <w:webHidden/>
           </w:rPr>
-          <w:t>35</w:t>
+          <w:t>36</w:t>
         </w:r>
         <w:r>
           <w:rPr>
@@ -2915,7 +2915,7 @@
           <w:lang w:val="es-AR" w:eastAsia="es-AR"/>
         </w:rPr>
       </w:pPr>
-      <w:hyperlink w:anchor="_Toc230369168" w:history="1">
+      <w:hyperlink w:anchor="_Toc230376320" w:history="1">
         <w:r>
           <w:rPr>
             <w:rStyle w:val="Hipervnculo"/>
@@ -2944,7 +2944,7 @@
             <w:noProof/>
             <w:webHidden/>
           </w:rPr>
-          <w:instrText xml:space="preserve"> PAGEREF _Toc230369168 \h </w:instrText>
+          <w:instrText xml:space="preserve"> PAGEREF _Toc230376320 \h </w:instrText>
         </w:r>
         <w:r>
           <w:rPr>
@@ -2988,7 +2988,7 @@
           <w:lang w:val="es-AR" w:eastAsia="es-AR"/>
         </w:rPr>
       </w:pPr>
-      <w:hyperlink w:anchor="_Toc230369169" w:history="1">
+      <w:hyperlink w:anchor="_Toc230376321" w:history="1">
         <w:r>
           <w:rPr>
             <w:rStyle w:val="Hipervnculo"/>
@@ -3015,7 +3015,7 @@
             <w:noProof/>
             <w:webHidden/>
           </w:rPr>
-          <w:instrText xml:space="preserve"> PAGEREF _Toc230369169 \h </w:instrText>
+          <w:instrText xml:space="preserve"> PAGEREF _Toc230376321 \h </w:instrText>
         </w:r>
         <w:r>
           <w:rPr>
@@ -3059,7 +3059,7 @@
           <w:lang w:val="es-AR" w:eastAsia="es-AR"/>
         </w:rPr>
       </w:pPr>
-      <w:hyperlink w:anchor="_Toc230369170" w:history="1">
+      <w:hyperlink w:anchor="_Toc230376322" w:history="1">
         <w:r>
           <w:rPr>
             <w:rStyle w:val="Hipervnculo"/>
@@ -3086,7 +3086,7 @@
             <w:noProof/>
             <w:webHidden/>
           </w:rPr>
-          <w:instrText xml:space="preserve"> PAGEREF _Toc230369170 \h </w:instrText>
+          <w:instrText xml:space="preserve"> PAGEREF _Toc230376322 \h </w:instrText>
         </w:r>
         <w:r>
           <w:rPr>
@@ -3130,7 +3130,7 @@
           <w:lang w:val="es-AR" w:eastAsia="es-AR"/>
         </w:rPr>
       </w:pPr>
-      <w:hyperlink w:anchor="_Toc230369171" w:history="1">
+      <w:hyperlink w:anchor="_Toc230376323" w:history="1">
         <w:r>
           <w:rPr>
             <w:rStyle w:val="Hipervnculo"/>
@@ -3157,7 +3157,7 @@
             <w:noProof/>
             <w:webHidden/>
           </w:rPr>
-          <w:instrText xml:space="preserve"> PAGEREF _Toc230369171 \h </w:instrText>
+          <w:instrText xml:space="preserve"> PAGEREF _Toc230376323 \h </w:instrText>
         </w:r>
         <w:r>
           <w:rPr>
@@ -3201,7 +3201,7 @@
           <w:lang w:val="es-AR" w:eastAsia="es-AR"/>
         </w:rPr>
       </w:pPr>
-      <w:hyperlink w:anchor="_Toc230369172" w:history="1">
+      <w:hyperlink w:anchor="_Toc230376324" w:history="1">
         <w:r>
           <w:rPr>
             <w:rStyle w:val="Hipervnculo"/>
@@ -3228,7 +3228,7 @@
             <w:noProof/>
             <w:webHidden/>
           </w:rPr>
-          <w:instrText xml:space="preserve"> PAGEREF _Toc230369172 \h </w:instrText>
+          <w:instrText xml:space="preserve"> PAGEREF _Toc230376324 \h </w:instrText>
         </w:r>
         <w:r>
           <w:rPr>
@@ -3272,7 +3272,7 @@
           <w:lang w:val="es-AR" w:eastAsia="es-AR"/>
         </w:rPr>
       </w:pPr>
-      <w:hyperlink w:anchor="_Toc230369173" w:history="1">
+      <w:hyperlink w:anchor="_Toc230376325" w:history="1">
         <w:r>
           <w:rPr>
             <w:rStyle w:val="Hipervnculo"/>
@@ -3299,7 +3299,7 @@
             <w:noProof/>
             <w:webHidden/>
           </w:rPr>
-          <w:instrText xml:space="preserve"> PAGEREF _Toc230369173 \h </w:instrText>
+          <w:instrText xml:space="preserve"> PAGEREF _Toc230376325 \h </w:instrText>
         </w:r>
         <w:r>
           <w:rPr>
@@ -3343,7 +3343,7 @@
           <w:lang w:val="es-AR" w:eastAsia="es-AR"/>
         </w:rPr>
       </w:pPr>
-      <w:hyperlink w:anchor="_Toc230369174" w:history="1">
+      <w:hyperlink w:anchor="_Toc230376326" w:history="1">
         <w:r>
           <w:rPr>
             <w:rStyle w:val="Hipervnculo"/>
@@ -3370,7 +3370,7 @@
             <w:noProof/>
             <w:webHidden/>
           </w:rPr>
-          <w:instrText xml:space="preserve"> PAGEREF _Toc230369174 \h </w:instrText>
+          <w:instrText xml:space="preserve"> PAGEREF _Toc230376326 \h </w:instrText>
         </w:r>
         <w:r>
           <w:rPr>
@@ -3414,7 +3414,7 @@
           <w:lang w:val="es-AR" w:eastAsia="es-AR"/>
         </w:rPr>
       </w:pPr>
-      <w:hyperlink w:anchor="_Toc230369175" w:history="1">
+      <w:hyperlink w:anchor="_Toc230376327" w:history="1">
         <w:r>
           <w:rPr>
             <w:rStyle w:val="Hipervnculo"/>
@@ -3441,7 +3441,7 @@
             <w:noProof/>
             <w:webHidden/>
           </w:rPr>
-          <w:instrText xml:space="preserve"> PAGEREF _Toc230369175 \h </w:instrText>
+          <w:instrText xml:space="preserve"> PAGEREF _Toc230376327 \h </w:instrText>
         </w:r>
         <w:r>
           <w:rPr>
@@ -3485,7 +3485,7 @@
           <w:lang w:val="es-AR" w:eastAsia="es-AR"/>
         </w:rPr>
       </w:pPr>
-      <w:hyperlink w:anchor="_Toc230369176" w:history="1">
+      <w:hyperlink w:anchor="_Toc230376328" w:history="1">
         <w:r>
           <w:rPr>
             <w:rStyle w:val="Hipervnculo"/>
@@ -3512,7 +3512,7 @@
             <w:noProof/>
             <w:webHidden/>
           </w:rPr>
-          <w:instrText xml:space="preserve"> PAGEREF _Toc230369176 \h </w:instrText>
+          <w:instrText xml:space="preserve"> PAGEREF _Toc230376328 \h </w:instrText>
         </w:r>
         <w:r>
           <w:rPr>
@@ -3556,7 +3556,7 @@
           <w:lang w:val="es-AR" w:eastAsia="es-AR"/>
         </w:rPr>
       </w:pPr>
-      <w:hyperlink w:anchor="_Toc230369177" w:history="1">
+      <w:hyperlink w:anchor="_Toc230376329" w:history="1">
         <w:r>
           <w:rPr>
             <w:rStyle w:val="Hipervnculo"/>
@@ -3583,7 +3583,7 @@
             <w:noProof/>
             <w:webHidden/>
           </w:rPr>
-          <w:instrText xml:space="preserve"> PAGEREF _Toc230369177 \h </w:instrText>
+          <w:instrText xml:space="preserve"> PAGEREF _Toc230376329 \h </w:instrText>
         </w:r>
         <w:r>
           <w:rPr>
@@ -3603,7 +3603,7 @@
             <w:noProof/>
             <w:webHidden/>
           </w:rPr>
-          <w:t>43</w:t>
+          <w:t>44</w:t>
         </w:r>
         <w:r>
           <w:rPr>
@@ -3627,7 +3627,7 @@
           <w:lang w:val="es-AR" w:eastAsia="es-AR"/>
         </w:rPr>
       </w:pPr>
-      <w:hyperlink w:anchor="_Toc230369178" w:history="1">
+      <w:hyperlink w:anchor="_Toc230376330" w:history="1">
         <w:r>
           <w:rPr>
             <w:rStyle w:val="Hipervnculo"/>
@@ -3654,7 +3654,7 @@
             <w:noProof/>
             <w:webHidden/>
           </w:rPr>
-          <w:instrText xml:space="preserve"> PAGEREF _Toc230369178 \h </w:instrText>
+          <w:instrText xml:space="preserve"> PAGEREF _Toc230376330 \h </w:instrText>
         </w:r>
         <w:r>
           <w:rPr>
@@ -3698,7 +3698,7 @@
           <w:lang w:val="es-AR" w:eastAsia="es-AR"/>
         </w:rPr>
       </w:pPr>
-      <w:hyperlink w:anchor="_Toc230369179" w:history="1">
+      <w:hyperlink w:anchor="_Toc230376331" w:history="1">
         <w:r>
           <w:rPr>
             <w:rStyle w:val="Hipervnculo"/>
@@ -3727,7 +3727,7 @@
             <w:noProof/>
             <w:webHidden/>
           </w:rPr>
-          <w:instrText xml:space="preserve"> PAGEREF _Toc230369179 \h </w:instrText>
+          <w:instrText xml:space="preserve"> PAGEREF _Toc230376331 \h </w:instrText>
         </w:r>
         <w:r>
           <w:rPr>
@@ -3747,7 +3747,7 @@
             <w:noProof/>
             <w:webHidden/>
           </w:rPr>
-          <w:t>46</w:t>
+          <w:t>49</w:t>
         </w:r>
         <w:r>
           <w:rPr>
@@ -3771,7 +3771,7 @@
           <w:lang w:val="es-AR" w:eastAsia="es-AR"/>
         </w:rPr>
       </w:pPr>
-      <w:hyperlink w:anchor="_Toc230369180" w:history="1">
+      <w:hyperlink w:anchor="_Toc230376332" w:history="1">
         <w:r>
           <w:rPr>
             <w:rStyle w:val="Hipervnculo"/>
@@ -3798,7 +3798,7 @@
             <w:noProof/>
             <w:webHidden/>
           </w:rPr>
-          <w:instrText xml:space="preserve"> PAGEREF _Toc230369180 \h </w:instrText>
+          <w:instrText xml:space="preserve"> PAGEREF _Toc230376332 \h </w:instrText>
         </w:r>
         <w:r>
           <w:rPr>
@@ -3818,7 +3818,7 @@
             <w:noProof/>
             <w:webHidden/>
           </w:rPr>
-          <w:t>46</w:t>
+          <w:t>49</w:t>
         </w:r>
         <w:r>
           <w:rPr>
@@ -3842,7 +3842,7 @@
           <w:lang w:val="es-AR" w:eastAsia="es-AR"/>
         </w:rPr>
       </w:pPr>
-      <w:hyperlink w:anchor="_Toc230369181" w:history="1">
+      <w:hyperlink w:anchor="_Toc230376333" w:history="1">
         <w:r>
           <w:rPr>
             <w:rStyle w:val="Hipervnculo"/>
@@ -3869,7 +3869,7 @@
             <w:noProof/>
             <w:webHidden/>
           </w:rPr>
-          <w:instrText xml:space="preserve"> PAGEREF _Toc230369181 \h </w:instrText>
+          <w:instrText xml:space="preserve"> PAGEREF _Toc230376333 \h </w:instrText>
         </w:r>
         <w:r>
           <w:rPr>
@@ -3889,7 +3889,7 @@
             <w:noProof/>
             <w:webHidden/>
           </w:rPr>
-          <w:t>46</w:t>
+          <w:t>50</w:t>
         </w:r>
         <w:r>
           <w:rPr>
@@ -3913,7 +3913,7 @@
           <w:lang w:val="es-AR" w:eastAsia="es-AR"/>
         </w:rPr>
       </w:pPr>
-      <w:hyperlink w:anchor="_Toc230369182" w:history="1">
+      <w:hyperlink w:anchor="_Toc230376334" w:history="1">
         <w:r>
           <w:rPr>
             <w:rStyle w:val="Hipervnculo"/>
@@ -3940,7 +3940,7 @@
             <w:noProof/>
             <w:webHidden/>
           </w:rPr>
-          <w:instrText xml:space="preserve"> PAGEREF _Toc230369182 \h </w:instrText>
+          <w:instrText xml:space="preserve"> PAGEREF _Toc230376334 \h </w:instrText>
         </w:r>
         <w:r>
           <w:rPr>
@@ -3960,7 +3960,7 @@
             <w:noProof/>
             <w:webHidden/>
           </w:rPr>
-          <w:t>47</w:t>
+          <w:t>51</w:t>
         </w:r>
         <w:r>
           <w:rPr>
@@ -3984,7 +3984,7 @@
           <w:lang w:val="es-AR" w:eastAsia="es-AR"/>
         </w:rPr>
       </w:pPr>
-      <w:hyperlink w:anchor="_Toc230369183" w:history="1">
+      <w:hyperlink w:anchor="_Toc230376335" w:history="1">
         <w:r>
           <w:rPr>
             <w:rStyle w:val="Hipervnculo"/>
@@ -4011,7 +4011,7 @@
             <w:noProof/>
             <w:webHidden/>
           </w:rPr>
-          <w:instrText xml:space="preserve"> PAGEREF _Toc230369183 \h </w:instrText>
+          <w:instrText xml:space="preserve"> PAGEREF _Toc230376335 \h </w:instrText>
         </w:r>
         <w:r>
           <w:rPr>
@@ -4031,7 +4031,7 @@
             <w:noProof/>
             <w:webHidden/>
           </w:rPr>
-          <w:t>47</w:t>
+          <w:t>51</w:t>
         </w:r>
         <w:r>
           <w:rPr>
@@ -4055,7 +4055,7 @@
           <w:lang w:val="es-AR" w:eastAsia="es-AR"/>
         </w:rPr>
       </w:pPr>
-      <w:hyperlink w:anchor="_Toc230369184" w:history="1">
+      <w:hyperlink w:anchor="_Toc230376336" w:history="1">
         <w:r>
           <w:rPr>
             <w:rStyle w:val="Hipervnculo"/>
@@ -4082,7 +4082,7 @@
             <w:noProof/>
             <w:webHidden/>
           </w:rPr>
-          <w:instrText xml:space="preserve"> PAGEREF _Toc230369184 \h </w:instrText>
+          <w:instrText xml:space="preserve"> PAGEREF _Toc230376336 \h </w:instrText>
         </w:r>
         <w:r>
           <w:rPr>
@@ -4102,7 +4102,7 @@
             <w:noProof/>
             <w:webHidden/>
           </w:rPr>
-          <w:t>48</w:t>
+          <w:t>52</w:t>
         </w:r>
         <w:r>
           <w:rPr>
@@ -4126,7 +4126,7 @@
           <w:lang w:val="es-AR" w:eastAsia="es-AR"/>
         </w:rPr>
       </w:pPr>
-      <w:hyperlink w:anchor="_Toc230369185" w:history="1">
+      <w:hyperlink w:anchor="_Toc230376337" w:history="1">
         <w:r>
           <w:rPr>
             <w:rStyle w:val="Hipervnculo"/>
@@ -4153,7 +4153,7 @@
             <w:noProof/>
             <w:webHidden/>
           </w:rPr>
-          <w:instrText xml:space="preserve"> PAGEREF _Toc230369185 \h </w:instrText>
+          <w:instrText xml:space="preserve"> PAGEREF _Toc230376337 \h </w:instrText>
         </w:r>
         <w:r>
           <w:rPr>
@@ -4173,7 +4173,7 @@
             <w:noProof/>
             <w:webHidden/>
           </w:rPr>
-          <w:t>48</w:t>
+          <w:t>53</w:t>
         </w:r>
         <w:r>
           <w:rPr>
@@ -4197,7 +4197,7 @@
           <w:lang w:val="es-AR" w:eastAsia="es-AR"/>
         </w:rPr>
       </w:pPr>
-      <w:hyperlink w:anchor="_Toc230369186" w:history="1">
+      <w:hyperlink w:anchor="_Toc230376338" w:history="1">
         <w:r>
           <w:rPr>
             <w:rStyle w:val="Hipervnculo"/>
@@ -4226,7 +4226,7 @@
             <w:noProof/>
             <w:webHidden/>
           </w:rPr>
-          <w:instrText xml:space="preserve"> PAGEREF _Toc230369186 \h </w:instrText>
+          <w:instrText xml:space="preserve"> PAGEREF _Toc230376338 \h </w:instrText>
         </w:r>
         <w:r>
           <w:rPr>
@@ -4246,7 +4246,7 @@
             <w:noProof/>
             <w:webHidden/>
           </w:rPr>
-          <w:t>50</w:t>
+          <w:t>55</w:t>
         </w:r>
         <w:r>
           <w:rPr>
@@ -4270,7 +4270,7 @@
           <w:lang w:val="es-AR" w:eastAsia="es-AR"/>
         </w:rPr>
       </w:pPr>
-      <w:hyperlink w:anchor="_Toc230369187" w:history="1">
+      <w:hyperlink w:anchor="_Toc230376339" w:history="1">
         <w:r>
           <w:rPr>
             <w:rStyle w:val="Hipervnculo"/>
@@ -4297,7 +4297,7 @@
             <w:noProof/>
             <w:webHidden/>
           </w:rPr>
-          <w:instrText xml:space="preserve"> PAGEREF _Toc230369187 \h </w:instrText>
+          <w:instrText xml:space="preserve"> PAGEREF _Toc230376339 \h </w:instrText>
         </w:r>
         <w:r>
           <w:rPr>
@@ -4317,7 +4317,7 @@
             <w:noProof/>
             <w:webHidden/>
           </w:rPr>
-          <w:t>50</w:t>
+          <w:t>55</w:t>
         </w:r>
         <w:r>
           <w:rPr>
@@ -4341,7 +4341,7 @@
           <w:lang w:val="es-AR" w:eastAsia="es-AR"/>
         </w:rPr>
       </w:pPr>
-      <w:hyperlink w:anchor="_Toc230369188" w:history="1">
+      <w:hyperlink w:anchor="_Toc230376340" w:history="1">
         <w:r>
           <w:rPr>
             <w:rStyle w:val="Hipervnculo"/>
@@ -4368,7 +4368,7 @@
             <w:noProof/>
             <w:webHidden/>
           </w:rPr>
-          <w:instrText xml:space="preserve"> PAGEREF _Toc230369188 \h </w:instrText>
+          <w:instrText xml:space="preserve"> PAGEREF _Toc230376340 \h </w:instrText>
         </w:r>
         <w:r>
           <w:rPr>
@@ -4388,7 +4388,7 @@
             <w:noProof/>
             <w:webHidden/>
           </w:rPr>
-          <w:t>51</w:t>
+          <w:t>56</w:t>
         </w:r>
         <w:r>
           <w:rPr>
@@ -4412,7 +4412,7 @@
           <w:lang w:val="es-AR" w:eastAsia="es-AR"/>
         </w:rPr>
       </w:pPr>
-      <w:hyperlink w:anchor="_Toc230369189" w:history="1">
+      <w:hyperlink w:anchor="_Toc230376341" w:history="1">
         <w:r>
           <w:rPr>
             <w:rStyle w:val="Hipervnculo"/>
@@ -4439,7 +4439,7 @@
             <w:noProof/>
             <w:webHidden/>
           </w:rPr>
-          <w:instrText xml:space="preserve"> PAGEREF _Toc230369189 \h </w:instrText>
+          <w:instrText xml:space="preserve"> PAGEREF _Toc230376341 \h </w:instrText>
         </w:r>
         <w:r>
           <w:rPr>
@@ -4459,7 +4459,7 @@
             <w:noProof/>
             <w:webHidden/>
           </w:rPr>
-          <w:t>52</w:t>
+          <w:t>57</w:t>
         </w:r>
         <w:r>
           <w:rPr>
@@ -4483,7 +4483,7 @@
           <w:lang w:val="es-AR" w:eastAsia="es-AR"/>
         </w:rPr>
       </w:pPr>
-      <w:hyperlink w:anchor="_Toc230369190" w:history="1">
+      <w:hyperlink w:anchor="_Toc230376342" w:history="1">
         <w:r>
           <w:rPr>
             <w:rStyle w:val="Hipervnculo"/>
@@ -4510,7 +4510,7 @@
             <w:noProof/>
             <w:webHidden/>
           </w:rPr>
-          <w:instrText xml:space="preserve"> PAGEREF _Toc230369190 \h </w:instrText>
+          <w:instrText xml:space="preserve"> PAGEREF _Toc230376342 \h </w:instrText>
         </w:r>
         <w:r>
           <w:rPr>
@@ -4530,7 +4530,7 @@
             <w:noProof/>
             <w:webHidden/>
           </w:rPr>
-          <w:t>52</w:t>
+          <w:t>57</w:t>
         </w:r>
         <w:r>
           <w:rPr>
@@ -4554,7 +4554,7 @@
           <w:lang w:val="es-AR" w:eastAsia="es-AR"/>
         </w:rPr>
       </w:pPr>
-      <w:hyperlink w:anchor="_Toc230369191" w:history="1">
+      <w:hyperlink w:anchor="_Toc230376343" w:history="1">
         <w:r>
           <w:rPr>
             <w:rStyle w:val="Hipervnculo"/>
@@ -4581,7 +4581,7 @@
             <w:noProof/>
             <w:webHidden/>
           </w:rPr>
-          <w:instrText xml:space="preserve"> PAGEREF _Toc230369191 \h </w:instrText>
+          <w:instrText xml:space="preserve"> PAGEREF _Toc230376343 \h </w:instrText>
         </w:r>
         <w:r>
           <w:rPr>
@@ -4601,7 +4601,7 @@
             <w:noProof/>
             <w:webHidden/>
           </w:rPr>
-          <w:t>53</w:t>
+          <w:t>58</w:t>
         </w:r>
         <w:r>
           <w:rPr>
@@ -4625,7 +4625,7 @@
           <w:lang w:val="es-AR" w:eastAsia="es-AR"/>
         </w:rPr>
       </w:pPr>
-      <w:hyperlink w:anchor="_Toc230369192" w:history="1">
+      <w:hyperlink w:anchor="_Toc230376344" w:history="1">
         <w:r>
           <w:rPr>
             <w:rStyle w:val="Hipervnculo"/>
@@ -4652,7 +4652,7 @@
             <w:noProof/>
             <w:webHidden/>
           </w:rPr>
-          <w:instrText xml:space="preserve"> PAGEREF _Toc230369192 \h </w:instrText>
+          <w:instrText xml:space="preserve"> PAGEREF _Toc230376344 \h </w:instrText>
         </w:r>
         <w:r>
           <w:rPr>
@@ -4672,7 +4672,7 @@
             <w:noProof/>
             <w:webHidden/>
           </w:rPr>
-          <w:t>65</w:t>
+          <w:t>70</w:t>
         </w:r>
         <w:r>
           <w:rPr>
@@ -4696,7 +4696,7 @@
           <w:lang w:val="es-AR" w:eastAsia="es-AR"/>
         </w:rPr>
       </w:pPr>
-      <w:hyperlink w:anchor="_Toc230369193" w:history="1">
+      <w:hyperlink w:anchor="_Toc230376345" w:history="1">
         <w:r>
           <w:rPr>
             <w:rStyle w:val="Hipervnculo"/>
@@ -4725,7 +4725,7 @@
             <w:noProof/>
             <w:webHidden/>
           </w:rPr>
-          <w:instrText xml:space="preserve"> PAGEREF _Toc230369193 \h </w:instrText>
+          <w:instrText xml:space="preserve"> PAGEREF _Toc230376345 \h </w:instrText>
         </w:r>
         <w:r>
           <w:rPr>
@@ -4745,7 +4745,7 @@
             <w:noProof/>
             <w:webHidden/>
           </w:rPr>
-          <w:t>66</w:t>
+          <w:t>71</w:t>
         </w:r>
         <w:r>
           <w:rPr>
@@ -4769,7 +4769,7 @@
           <w:lang w:val="es-AR" w:eastAsia="es-AR"/>
         </w:rPr>
       </w:pPr>
-      <w:hyperlink w:anchor="_Toc230369194" w:history="1">
+      <w:hyperlink w:anchor="_Toc230376346" w:history="1">
         <w:r>
           <w:rPr>
             <w:rStyle w:val="Hipervnculo"/>
@@ -4796,7 +4796,7 @@
             <w:noProof/>
             <w:webHidden/>
           </w:rPr>
-          <w:instrText xml:space="preserve"> PAGEREF _Toc230369194 \h </w:instrText>
+          <w:instrText xml:space="preserve"> PAGEREF _Toc230376346 \h </w:instrText>
         </w:r>
         <w:r>
           <w:rPr>
@@ -4816,7 +4816,7 @@
             <w:noProof/>
             <w:webHidden/>
           </w:rPr>
-          <w:t>66</w:t>
+          <w:t>71</w:t>
         </w:r>
         <w:r>
           <w:rPr>
@@ -4840,7 +4840,7 @@
           <w:lang w:val="es-AR" w:eastAsia="es-AR"/>
         </w:rPr>
       </w:pPr>
-      <w:hyperlink w:anchor="_Toc230369195" w:history="1">
+      <w:hyperlink w:anchor="_Toc230376347" w:history="1">
         <w:r>
           <w:rPr>
             <w:rStyle w:val="Hipervnculo"/>
@@ -4867,7 +4867,7 @@
             <w:noProof/>
             <w:webHidden/>
           </w:rPr>
-          <w:instrText xml:space="preserve"> PAGEREF _Toc230369195 \h </w:instrText>
+          <w:instrText xml:space="preserve"> PAGEREF _Toc230376347 \h </w:instrText>
         </w:r>
         <w:r>
           <w:rPr>
@@ -4887,7 +4887,7 @@
             <w:noProof/>
             <w:webHidden/>
           </w:rPr>
-          <w:t>66</w:t>
+          <w:t>71</w:t>
         </w:r>
         <w:r>
           <w:rPr>
@@ -4911,7 +4911,7 @@
           <w:lang w:val="es-AR" w:eastAsia="es-AR"/>
         </w:rPr>
       </w:pPr>
-      <w:hyperlink w:anchor="_Toc230369196" w:history="1">
+      <w:hyperlink w:anchor="_Toc230376348" w:history="1">
         <w:r>
           <w:rPr>
             <w:rStyle w:val="Hipervnculo"/>
@@ -4938,7 +4938,7 @@
             <w:noProof/>
             <w:webHidden/>
           </w:rPr>
-          <w:instrText xml:space="preserve"> PAGEREF _Toc230369196 \h </w:instrText>
+          <w:instrText xml:space="preserve"> PAGEREF _Toc230376348 \h </w:instrText>
         </w:r>
         <w:r>
           <w:rPr>
@@ -4958,7 +4958,7 @@
             <w:noProof/>
             <w:webHidden/>
           </w:rPr>
-          <w:t>67</w:t>
+          <w:t>72</w:t>
         </w:r>
         <w:r>
           <w:rPr>
@@ -4982,7 +4982,7 @@
           <w:lang w:val="es-AR" w:eastAsia="es-AR"/>
         </w:rPr>
       </w:pPr>
-      <w:hyperlink w:anchor="_Toc230369197" w:history="1">
+      <w:hyperlink w:anchor="_Toc230376349" w:history="1">
         <w:r>
           <w:rPr>
             <w:rStyle w:val="Hipervnculo"/>
@@ -5009,7 +5009,7 @@
             <w:noProof/>
             <w:webHidden/>
           </w:rPr>
-          <w:instrText xml:space="preserve"> PAGEREF _Toc230369197 \h </w:instrText>
+          <w:instrText xml:space="preserve"> PAGEREF _Toc230376349 \h </w:instrText>
         </w:r>
         <w:r>
           <w:rPr>
@@ -5029,7 +5029,7 @@
             <w:noProof/>
             <w:webHidden/>
           </w:rPr>
-          <w:t>67</w:t>
+          <w:t>72</w:t>
         </w:r>
         <w:r>
           <w:rPr>
@@ -5053,7 +5053,7 @@
           <w:lang w:val="es-AR" w:eastAsia="es-AR"/>
         </w:rPr>
       </w:pPr>
-      <w:hyperlink w:anchor="_Toc230369198" w:history="1">
+      <w:hyperlink w:anchor="_Toc230376350" w:history="1">
         <w:r>
           <w:rPr>
             <w:rStyle w:val="Hipervnculo"/>
@@ -5081,7 +5081,7 @@
             <w:noProof/>
             <w:webHidden/>
           </w:rPr>
-          <w:instrText xml:space="preserve"> PAGEREF _Toc230369198 \h </w:instrText>
+          <w:instrText xml:space="preserve"> PAGEREF _Toc230376350 \h </w:instrText>
         </w:r>
         <w:r>
           <w:rPr>
@@ -5101,7 +5101,7 @@
             <w:noProof/>
             <w:webHidden/>
           </w:rPr>
-          <w:t>69</w:t>
+          <w:t>74</w:t>
         </w:r>
         <w:r>
           <w:rPr>
@@ -5125,7 +5125,7 @@
           <w:lang w:val="es-AR" w:eastAsia="es-AR"/>
         </w:rPr>
       </w:pPr>
-      <w:hyperlink w:anchor="_Toc230369199" w:history="1">
+      <w:hyperlink w:anchor="_Toc230376351" w:history="1">
         <w:r>
           <w:rPr>
             <w:rStyle w:val="Hipervnculo"/>
@@ -5152,7 +5152,7 @@
             <w:noProof/>
             <w:webHidden/>
           </w:rPr>
-          <w:instrText xml:space="preserve"> PAGEREF _Toc230369199 \h </w:instrText>
+          <w:instrText xml:space="preserve"> PAGEREF _Toc230376351 \h </w:instrText>
         </w:r>
         <w:r>
           <w:rPr>
@@ -5172,7 +5172,7 @@
             <w:noProof/>
             <w:webHidden/>
           </w:rPr>
-          <w:t>70</w:t>
+          <w:t>75</w:t>
         </w:r>
         <w:r>
           <w:rPr>
@@ -5196,7 +5196,7 @@
           <w:lang w:val="es-AR" w:eastAsia="es-AR"/>
         </w:rPr>
       </w:pPr>
-      <w:hyperlink w:anchor="_Toc230369200" w:history="1">
+      <w:hyperlink w:anchor="_Toc230376352" w:history="1">
         <w:r>
           <w:rPr>
             <w:rStyle w:val="Hipervnculo"/>
@@ -5223,7 +5223,7 @@
             <w:noProof/>
             <w:webHidden/>
           </w:rPr>
-          <w:instrText xml:space="preserve"> PAGEREF _Toc230369200 \h </w:instrText>
+          <w:instrText xml:space="preserve"> PAGEREF _Toc230376352 \h </w:instrText>
         </w:r>
         <w:r>
           <w:rPr>
@@ -5243,7 +5243,7 @@
             <w:noProof/>
             <w:webHidden/>
           </w:rPr>
-          <w:t>70</w:t>
+          <w:t>75</w:t>
         </w:r>
         <w:r>
           <w:rPr>
@@ -5267,7 +5267,7 @@
           <w:lang w:val="es-AR" w:eastAsia="es-AR"/>
         </w:rPr>
       </w:pPr>
-      <w:hyperlink w:anchor="_Toc230369201" w:history="1">
+      <w:hyperlink w:anchor="_Toc230376353" w:history="1">
         <w:r>
           <w:rPr>
             <w:rStyle w:val="Hipervnculo"/>
@@ -5294,7 +5294,7 @@
             <w:noProof/>
             <w:webHidden/>
           </w:rPr>
-          <w:instrText xml:space="preserve"> PAGEREF _Toc230369201 \h </w:instrText>
+          <w:instrText xml:space="preserve"> PAGEREF _Toc230376353 \h </w:instrText>
         </w:r>
         <w:r>
           <w:rPr>
@@ -5314,7 +5314,7 @@
             <w:noProof/>
             <w:webHidden/>
           </w:rPr>
-          <w:t>70</w:t>
+          <w:t>75</w:t>
         </w:r>
         <w:r>
           <w:rPr>
@@ -5338,7 +5338,7 @@
           <w:lang w:val="es-AR" w:eastAsia="es-AR"/>
         </w:rPr>
       </w:pPr>
-      <w:hyperlink w:anchor="_Toc230369202" w:history="1">
+      <w:hyperlink w:anchor="_Toc230376354" w:history="1">
         <w:r>
           <w:rPr>
             <w:rStyle w:val="Hipervnculo"/>
@@ -5365,7 +5365,7 @@
             <w:noProof/>
             <w:webHidden/>
           </w:rPr>
-          <w:instrText xml:space="preserve"> PAGEREF _Toc230369202 \h </w:instrText>
+          <w:instrText xml:space="preserve"> PAGEREF _Toc230376354 \h </w:instrText>
         </w:r>
         <w:r>
           <w:rPr>
@@ -5385,7 +5385,7 @@
             <w:noProof/>
             <w:webHidden/>
           </w:rPr>
-          <w:t>71</w:t>
+          <w:t>76</w:t>
         </w:r>
         <w:r>
           <w:rPr>
@@ -5409,7 +5409,7 @@
           <w:lang w:val="es-AR" w:eastAsia="es-AR"/>
         </w:rPr>
       </w:pPr>
-      <w:hyperlink w:anchor="_Toc230369203" w:history="1">
+      <w:hyperlink w:anchor="_Toc230376355" w:history="1">
         <w:r>
           <w:rPr>
             <w:rStyle w:val="Hipervnculo"/>
@@ -5436,7 +5436,7 @@
             <w:noProof/>
             <w:webHidden/>
           </w:rPr>
-          <w:instrText xml:space="preserve"> PAGEREF _Toc230369203 \h </w:instrText>
+          <w:instrText xml:space="preserve"> PAGEREF _Toc230376355 \h </w:instrText>
         </w:r>
         <w:r>
           <w:rPr>
@@ -5456,7 +5456,7 @@
             <w:noProof/>
             <w:webHidden/>
           </w:rPr>
-          <w:t>74</w:t>
+          <w:t>79</w:t>
         </w:r>
         <w:r>
           <w:rPr>
@@ -5480,7 +5480,7 @@
           <w:lang w:val="es-AR" w:eastAsia="es-AR"/>
         </w:rPr>
       </w:pPr>
-      <w:hyperlink w:anchor="_Toc230369204" w:history="1">
+      <w:hyperlink w:anchor="_Toc230376356" w:history="1">
         <w:r>
           <w:rPr>
             <w:rStyle w:val="Hipervnculo"/>
@@ -5507,7 +5507,7 @@
             <w:noProof/>
             <w:webHidden/>
           </w:rPr>
-          <w:instrText xml:space="preserve"> PAGEREF _Toc230369204 \h </w:instrText>
+          <w:instrText xml:space="preserve"> PAGEREF _Toc230376356 \h </w:instrText>
         </w:r>
         <w:r>
           <w:rPr>
@@ -5527,7 +5527,7 @@
             <w:noProof/>
             <w:webHidden/>
           </w:rPr>
-          <w:t>74</w:t>
+          <w:t>79</w:t>
         </w:r>
         <w:r>
           <w:rPr>
@@ -5551,7 +5551,7 @@
           <w:lang w:val="es-AR" w:eastAsia="es-AR"/>
         </w:rPr>
       </w:pPr>
-      <w:hyperlink w:anchor="_Toc230369205" w:history="1">
+      <w:hyperlink w:anchor="_Toc230376357" w:history="1">
         <w:r>
           <w:rPr>
             <w:rStyle w:val="Hipervnculo"/>
@@ -5578,7 +5578,7 @@
             <w:noProof/>
             <w:webHidden/>
           </w:rPr>
-          <w:instrText xml:space="preserve"> PAGEREF _Toc230369205 \h </w:instrText>
+          <w:instrText xml:space="preserve"> PAGEREF _Toc230376357 \h </w:instrText>
         </w:r>
         <w:r>
           <w:rPr>
@@ -5598,7 +5598,7 @@
             <w:noProof/>
             <w:webHidden/>
           </w:rPr>
-          <w:t>74</w:t>
+          <w:t>79</w:t>
         </w:r>
         <w:r>
           <w:rPr>
@@ -5622,7 +5622,7 @@
           <w:lang w:val="es-AR" w:eastAsia="es-AR"/>
         </w:rPr>
       </w:pPr>
-      <w:hyperlink w:anchor="_Toc230369206" w:history="1">
+      <w:hyperlink w:anchor="_Toc230376358" w:history="1">
         <w:r>
           <w:rPr>
             <w:rStyle w:val="Hipervnculo"/>
@@ -5649,7 +5649,7 @@
             <w:noProof/>
             <w:webHidden/>
           </w:rPr>
-          <w:instrText xml:space="preserve"> PAGEREF _Toc230369206 \h </w:instrText>
+          <w:instrText xml:space="preserve"> PAGEREF _Toc230376358 \h </w:instrText>
         </w:r>
         <w:r>
           <w:rPr>
@@ -5669,7 +5669,149 @@
             <w:noProof/>
             <w:webHidden/>
           </w:rPr>
-          <w:t>75</w:t>
+          <w:t>80</w:t>
+        </w:r>
+        <w:r>
+          <w:rPr>
+            <w:noProof/>
+            <w:webHidden/>
+          </w:rPr>
+          <w:fldChar w:fldCharType="end"/>
+        </w:r>
+      </w:hyperlink>
+    </w:p>
+    <w:p>
+      <w:pPr>
+        <w:pStyle w:val="TDC2"/>
+        <w:tabs>
+          <w:tab w:val="right" w:leader="dot" w:pos="8828"/>
+        </w:tabs>
+        <w:rPr>
+          <w:rFonts w:asciiTheme="minorHAnsi" w:eastAsiaTheme="minorEastAsia" w:hAnsiTheme="minorHAnsi"/>
+          <w:noProof/>
+          <w:szCs w:val="22"/>
+          <w:lang w:val="es-AR" w:eastAsia="es-AR"/>
+        </w:rPr>
+      </w:pPr>
+      <w:hyperlink w:anchor="_Toc230376359" w:history="1">
+        <w:r>
+          <w:rPr>
+            <w:rStyle w:val="Hipervnculo"/>
+            <w:noProof/>
+          </w:rPr>
+          <w:t>10.4 Diagramas ampliados</w:t>
+        </w:r>
+        <w:r>
+          <w:rPr>
+            <w:noProof/>
+            <w:webHidden/>
+          </w:rPr>
+          <w:tab/>
+        </w:r>
+        <w:r>
+          <w:rPr>
+            <w:noProof/>
+            <w:webHidden/>
+          </w:rPr>
+          <w:fldChar w:fldCharType="begin"/>
+        </w:r>
+        <w:r>
+          <w:rPr>
+            <w:noProof/>
+            <w:webHidden/>
+          </w:rPr>
+          <w:instrText xml:space="preserve"> PAGEREF _Toc230376359 \h </w:instrText>
+        </w:r>
+        <w:r>
+          <w:rPr>
+            <w:noProof/>
+            <w:webHidden/>
+          </w:rPr>
+        </w:r>
+        <w:r>
+          <w:rPr>
+            <w:noProof/>
+            <w:webHidden/>
+          </w:rPr>
+          <w:fldChar w:fldCharType="separate"/>
+        </w:r>
+        <w:r>
+          <w:rPr>
+            <w:noProof/>
+            <w:webHidden/>
+          </w:rPr>
+          <w:t>81</w:t>
+        </w:r>
+        <w:r>
+          <w:rPr>
+            <w:noProof/>
+            <w:webHidden/>
+          </w:rPr>
+          <w:fldChar w:fldCharType="end"/>
+        </w:r>
+      </w:hyperlink>
+    </w:p>
+    <w:p>
+      <w:pPr>
+        <w:pStyle w:val="TDC2"/>
+        <w:tabs>
+          <w:tab w:val="right" w:leader="dot" w:pos="8828"/>
+        </w:tabs>
+        <w:rPr>
+          <w:rFonts w:asciiTheme="minorHAnsi" w:eastAsiaTheme="minorEastAsia" w:hAnsiTheme="minorHAnsi"/>
+          <w:noProof/>
+          <w:szCs w:val="22"/>
+          <w:lang w:val="es-AR" w:eastAsia="es-AR"/>
+        </w:rPr>
+      </w:pPr>
+      <w:hyperlink w:anchor="_Toc230376360" w:history="1">
+        <w:r>
+          <w:rPr>
+            <w:rStyle w:val="Hipervnculo"/>
+            <w:noProof/>
+          </w:rPr>
+          <w:t>10.5 Casos de uso ampliados</w:t>
+        </w:r>
+        <w:r>
+          <w:rPr>
+            <w:noProof/>
+            <w:webHidden/>
+          </w:rPr>
+          <w:tab/>
+        </w:r>
+        <w:r>
+          <w:rPr>
+            <w:noProof/>
+            <w:webHidden/>
+          </w:rPr>
+          <w:fldChar w:fldCharType="begin"/>
+        </w:r>
+        <w:r>
+          <w:rPr>
+            <w:noProof/>
+            <w:webHidden/>
+          </w:rPr>
+          <w:instrText xml:space="preserve"> PAGEREF _Toc230376360 \h </w:instrText>
+        </w:r>
+        <w:r>
+          <w:rPr>
+            <w:noProof/>
+            <w:webHidden/>
+          </w:rPr>
+        </w:r>
+        <w:r>
+          <w:rPr>
+            <w:noProof/>
+            <w:webHidden/>
+          </w:rPr>
+          <w:fldChar w:fldCharType="separate"/>
+        </w:r>
+        <w:r>
+          <w:rPr>
+            <w:noProof/>
+            <w:webHidden/>
+          </w:rPr>
+          <w:t>86</w:t>
         </w:r>
         <w:r>
           <w:rPr>
@@ -5703,7 +5845,7 @@
         <w:pStyle w:val="Ttulo1"/>
       </w:pPr>
       <w:bookmarkStart w:id="0" w:name="_Toc230197648"/>
-      <w:bookmarkStart w:id="1" w:name="_Toc230369134"/>
+      <w:bookmarkStart w:id="1" w:name="_Toc230376286"/>
       <w:r>
         <w:lastRenderedPageBreak/>
         <w:t>LISTA DE FIGURAS</w:t>
@@ -5713,12 +5855,61 @@
     </w:p>
     <w:p>
       <w:r>
+        <w:t xml:space="preserve">Figura 4-1. Diagrama de componentes de </w:t>
+      </w:r>
+      <w:r>
+        <w:t>TPScouting.</w:t>
+      </w:r>
+    </w:p>
+    <w:p>
+      <w:r>
+        <w:t>Figura 4-2. Diagrama de clases del modelo de dominio.</w:t>
+      </w:r>
+    </w:p>
+    <w:p>
+      <w:r>
+        <w:t>Figura 4-3. Diagrama de casos de uso general.</w:t>
+      </w:r>
+    </w:p>
+    <w:p>
+      <w:r>
+        <w:t>Figura 4-4. Diagrama de casos de uso de gestión de jugadores.</w:t>
+      </w:r>
+    </w:p>
+    <w:p>
+      <w:r>
+        <w:t>Figura 4-5. Diagrama de casos de uso de análisis y decisión scout.</w:t>
+      </w:r>
+    </w:p>
+    <w:p>
+      <w:r>
+        <w:t>Figura 5-1. Sec</w:t>
+      </w:r>
+      <w:r>
+        <w:t>uencia de prediccion de potencial de jugador.</w:t>
+      </w:r>
+    </w:p>
+    <w:p>
+      <w:r>
+        <w:t>Figura 5-2. Secuencia de carga del panel general.</w:t>
+      </w:r>
+    </w:p>
+    <w:p>
+      <w:r>
+        <w:t>Figura 5-3. Diagrama de despliegue en Render.</w:t>
+      </w:r>
+    </w:p>
+    <w:p>
+      <w:r>
         <w:t>Figura 6-1. Curva real de entrenamiento desde training_metadata.json.</w:t>
       </w:r>
     </w:p>
     <w:p>
       <w:r>
-        <w:t>Figura 6-2. Login del MVP desplegado en Render.</w:t>
+        <w:t>Figura 6-2. Login del MVP desplegado en Rend</w:t>
+      </w:r>
+      <w:r>
+        <w:t>er.</w:t>
       </w:r>
     </w:p>
     <w:p>
@@ -5747,12 +5938,59 @@
       </w:r>
     </w:p>
     <w:p>
+      <w:r>
+        <w:t xml:space="preserve">Figura 10-1. </w:t>
+      </w:r>
+      <w:r>
+        <w:t>Diagrama de componentes de TPScouting ampliado.</w:t>
+      </w:r>
+    </w:p>
+    <w:p>
+      <w:r>
+        <w:t>Figura 10-2. Diagrama de clases del modelo de dominio ampliado.</w:t>
+      </w:r>
+    </w:p>
+    <w:p>
+      <w:r>
+        <w:t>Figura 10-3. Diagrama de secuencia de predicción ampliado.</w:t>
+      </w:r>
+    </w:p>
+    <w:p>
+      <w:r>
+        <w:t>Figura 10-4. Diagrama de secuencia del panel general ampliado.</w:t>
+      </w:r>
+    </w:p>
+    <w:p>
+      <w:r>
+        <w:t xml:space="preserve">Figura 10-5. Diagrama </w:t>
+      </w:r>
+      <w:r>
+        <w:t>de despliegue en Render ampliado.</w:t>
+      </w:r>
+    </w:p>
+    <w:p>
+      <w:r>
+        <w:t>Figura 10-6. Diagrama de casos de uso general ampliado.</w:t>
+      </w:r>
+    </w:p>
+    <w:p>
+      <w:r>
+        <w:t>Figura 10-7. Diagrama de casos de uso de gestión de jugadores ampliado.</w:t>
+      </w:r>
+    </w:p>
+    <w:p>
+      <w:r>
+        <w:t>Figura 10-8. Diagrama de casos de uso de análisis y decisión scout ampliado.</w:t>
+      </w:r>
+    </w:p>
+    <w:p>
       <w:pPr>
         <w:pStyle w:val="Ttulo1"/>
       </w:pPr>
       <w:bookmarkStart w:id="2" w:name="_Toc230197649"/>
-      <w:bookmarkStart w:id="3" w:name="_Toc230369135"/>
-      <w:r>
+      <w:bookmarkStart w:id="3" w:name="_Toc230376287"/>
+      <w:r>
+        <w:lastRenderedPageBreak/>
         <w:t>LISTA DE TABLAS</w:t>
       </w:r>
       <w:bookmarkEnd w:id="2"/>
@@ -5840,7 +6078,6 @@
     </w:p>
     <w:p>
       <w:r>
-        <w:lastRenderedPageBreak/>
         <w:t>Tabla 6-4. Comparación con baselines.</w:t>
       </w:r>
     </w:p>
@@ -5887,7 +6124,7 @@
         <w:pStyle w:val="Ttulo1"/>
       </w:pPr>
       <w:bookmarkStart w:id="4" w:name="_Toc230197650"/>
-      <w:bookmarkStart w:id="5" w:name="_Toc230369136"/>
+      <w:bookmarkStart w:id="5" w:name="_Toc230376288"/>
       <w:r>
         <w:lastRenderedPageBreak/>
         <w:t>RESUMEN</w:t>
@@ -5931,7 +6168,7 @@
         </w:rPr>
       </w:pPr>
       <w:bookmarkStart w:id="6" w:name="_Toc230197652"/>
-      <w:bookmarkStart w:id="7" w:name="_Toc230369137"/>
+      <w:bookmarkStart w:id="7" w:name="_Toc230376289"/>
       <w:r>
         <w:rPr>
           <w:rFonts w:ascii="Arial" w:hAnsi="Arial" w:cs="Arial"/>
@@ -5955,7 +6192,7 @@
       </w:pPr>
       <w:bookmarkStart w:id="8" w:name="_Toc230120358"/>
       <w:bookmarkStart w:id="9" w:name="_Toc230197653"/>
-      <w:bookmarkStart w:id="10" w:name="_Toc230369138"/>
+      <w:bookmarkStart w:id="10" w:name="_Toc230376290"/>
       <w:r>
         <w:rPr>
           <w:rFonts w:ascii="Arial" w:hAnsi="Arial" w:cs="Arial"/>
@@ -6257,7 +6494,7 @@
       </w:pPr>
       <w:bookmarkStart w:id="11" w:name="_Toc230120359"/>
       <w:bookmarkStart w:id="12" w:name="_Toc230197654"/>
-      <w:bookmarkStart w:id="13" w:name="_Toc230369139"/>
+      <w:bookmarkStart w:id="13" w:name="_Toc230376291"/>
       <w:r>
         <w:rPr>
           <w:rFonts w:ascii="Arial" w:hAnsi="Arial" w:cs="Arial"/>
@@ -6447,7 +6684,7 @@
       </w:pPr>
       <w:bookmarkStart w:id="14" w:name="_Toc230120360"/>
       <w:bookmarkStart w:id="15" w:name="_Toc230197655"/>
-      <w:bookmarkStart w:id="16" w:name="_Toc230369140"/>
+      <w:bookmarkStart w:id="16" w:name="_Toc230376292"/>
       <w:r>
         <w:rPr>
           <w:rFonts w:ascii="Arial" w:hAnsi="Arial" w:cs="Arial"/>
@@ -6492,7 +6729,7 @@
       </w:pPr>
       <w:bookmarkStart w:id="17" w:name="_Toc230120361"/>
       <w:bookmarkStart w:id="18" w:name="_Toc230197656"/>
-      <w:bookmarkStart w:id="19" w:name="_Toc230369141"/>
+      <w:bookmarkStart w:id="19" w:name="_Toc230376293"/>
       <w:r>
         <w:rPr>
           <w:rFonts w:ascii="Arial" w:hAnsi="Arial" w:cs="Arial"/>
@@ -6591,7 +6828,7 @@
       </w:pPr>
       <w:bookmarkStart w:id="20" w:name="_Toc230120362"/>
       <w:bookmarkStart w:id="21" w:name="_Toc230197657"/>
-      <w:bookmarkStart w:id="22" w:name="_Toc230369142"/>
+      <w:bookmarkStart w:id="22" w:name="_Toc230376294"/>
       <w:r>
         <w:rPr>
           <w:rFonts w:ascii="Arial" w:hAnsi="Arial" w:cs="Arial"/>
@@ -6690,7 +6927,7 @@
       </w:pPr>
       <w:bookmarkStart w:id="23" w:name="_Toc230120363"/>
       <w:bookmarkStart w:id="24" w:name="_Toc230197658"/>
-      <w:bookmarkStart w:id="25" w:name="_Toc230369143"/>
+      <w:bookmarkStart w:id="25" w:name="_Toc230376295"/>
       <w:r>
         <w:rPr>
           <w:rFonts w:ascii="Arial" w:hAnsi="Arial" w:cs="Arial"/>
@@ -6869,7 +7106,7 @@
       </w:pPr>
       <w:bookmarkStart w:id="26" w:name="_Toc230120364"/>
       <w:bookmarkStart w:id="27" w:name="_Toc230197659"/>
-      <w:bookmarkStart w:id="28" w:name="_Toc230369144"/>
+      <w:bookmarkStart w:id="28" w:name="_Toc230376296"/>
       <w:r>
         <w:rPr>
           <w:rFonts w:ascii="Arial" w:hAnsi="Arial" w:cs="Arial"/>
@@ -7195,7 +7432,7 @@
       </w:pPr>
       <w:bookmarkStart w:id="29" w:name="_Toc230120365"/>
       <w:bookmarkStart w:id="30" w:name="_Toc230197660"/>
-      <w:bookmarkStart w:id="31" w:name="_Toc230369145"/>
+      <w:bookmarkStart w:id="31" w:name="_Toc230376297"/>
       <w:r>
         <w:rPr>
           <w:rFonts w:ascii="Arial" w:hAnsi="Arial" w:cs="Arial"/>
@@ -7221,7 +7458,7 @@
       </w:pPr>
       <w:bookmarkStart w:id="32" w:name="_Toc230120366"/>
       <w:bookmarkStart w:id="33" w:name="_Toc230197661"/>
-      <w:bookmarkStart w:id="34" w:name="_Toc230369146"/>
+      <w:bookmarkStart w:id="34" w:name="_Toc230376298"/>
       <w:r>
         <w:rPr>
           <w:rFonts w:ascii="Arial" w:hAnsi="Arial" w:cs="Arial"/>
@@ -7247,7 +7484,7 @@
       </w:pPr>
       <w:bookmarkStart w:id="35" w:name="_Toc230120367"/>
       <w:bookmarkStart w:id="36" w:name="_Toc230197662"/>
-      <w:bookmarkStart w:id="37" w:name="_Toc230369147"/>
+      <w:bookmarkStart w:id="37" w:name="_Toc230376299"/>
       <w:r>
         <w:rPr>
           <w:rFonts w:ascii="Arial" w:hAnsi="Arial" w:cs="Arial"/>
@@ -7473,7 +7710,7 @@
       </w:pPr>
       <w:bookmarkStart w:id="38" w:name="_Toc230120368"/>
       <w:bookmarkStart w:id="39" w:name="_Toc230197663"/>
-      <w:bookmarkStart w:id="40" w:name="_Toc230369148"/>
+      <w:bookmarkStart w:id="40" w:name="_Toc230376300"/>
       <w:r>
         <w:rPr>
           <w:rFonts w:ascii="Arial" w:hAnsi="Arial" w:cs="Arial"/>
@@ -7648,7 +7885,7 @@
       </w:pPr>
       <w:bookmarkStart w:id="41" w:name="_Toc230120369"/>
       <w:bookmarkStart w:id="42" w:name="_Toc230197664"/>
-      <w:bookmarkStart w:id="43" w:name="_Toc230369149"/>
+      <w:bookmarkStart w:id="43" w:name="_Toc230376301"/>
       <w:r>
         <w:rPr>
           <w:rFonts w:ascii="Arial" w:hAnsi="Arial" w:cs="Arial"/>
@@ -7884,7 +8121,7 @@
       </w:pPr>
       <w:bookmarkStart w:id="44" w:name="_Toc230120370"/>
       <w:bookmarkStart w:id="45" w:name="_Toc230197665"/>
-      <w:bookmarkStart w:id="46" w:name="_Toc230369150"/>
+      <w:bookmarkStart w:id="46" w:name="_Toc230376302"/>
       <w:r>
         <w:rPr>
           <w:rFonts w:ascii="Arial" w:hAnsi="Arial" w:cs="Arial"/>
@@ -8186,7 +8423,7 @@
       </w:pPr>
       <w:bookmarkStart w:id="47" w:name="_Toc230120371"/>
       <w:bookmarkStart w:id="48" w:name="_Toc230197666"/>
-      <w:bookmarkStart w:id="49" w:name="_Toc230369151"/>
+      <w:bookmarkStart w:id="49" w:name="_Toc230376303"/>
       <w:r>
         <w:rPr>
           <w:rFonts w:ascii="Arial" w:hAnsi="Arial" w:cs="Arial"/>
@@ -8390,7 +8627,7 @@
       </w:pPr>
       <w:bookmarkStart w:id="50" w:name="_Toc230120372"/>
       <w:bookmarkStart w:id="51" w:name="_Toc230197667"/>
-      <w:bookmarkStart w:id="52" w:name="_Toc230369152"/>
+      <w:bookmarkStart w:id="52" w:name="_Toc230376304"/>
       <w:r>
         <w:rPr>
           <w:rFonts w:ascii="Arial" w:hAnsi="Arial" w:cs="Arial"/>
@@ -8489,7 +8726,7 @@
       </w:pPr>
       <w:bookmarkStart w:id="53" w:name="_Toc230120373"/>
       <w:bookmarkStart w:id="54" w:name="_Toc230197668"/>
-      <w:bookmarkStart w:id="55" w:name="_Toc230369153"/>
+      <w:bookmarkStart w:id="55" w:name="_Toc230376305"/>
       <w:r>
         <w:rPr>
           <w:rFonts w:ascii="Arial" w:hAnsi="Arial" w:cs="Arial"/>
@@ -8606,7 +8843,7 @@
       </w:pPr>
       <w:bookmarkStart w:id="56" w:name="_Toc230120374"/>
       <w:bookmarkStart w:id="57" w:name="_Toc230197669"/>
-      <w:bookmarkStart w:id="58" w:name="_Toc230369154"/>
+      <w:bookmarkStart w:id="58" w:name="_Toc230376306"/>
       <w:r>
         <w:rPr>
           <w:sz w:val="28"/>
@@ -8672,7 +8909,7 @@
       </w:pPr>
       <w:bookmarkStart w:id="59" w:name="_Toc230120375"/>
       <w:bookmarkStart w:id="60" w:name="_Toc230197670"/>
-      <w:bookmarkStart w:id="61" w:name="_Toc230369155"/>
+      <w:bookmarkStart w:id="61" w:name="_Toc230376307"/>
       <w:r>
         <w:rPr>
           <w:rFonts w:ascii="Arial" w:hAnsi="Arial" w:cs="Arial"/>
@@ -8695,7 +8932,7 @@
       </w:pPr>
       <w:bookmarkStart w:id="62" w:name="_Toc230120376"/>
       <w:bookmarkStart w:id="63" w:name="_Toc230197671"/>
-      <w:bookmarkStart w:id="64" w:name="_Toc230369156"/>
+      <w:bookmarkStart w:id="64" w:name="_Toc230376308"/>
       <w:r>
         <w:rPr>
           <w:sz w:val="28"/>
@@ -8731,7 +8968,7 @@
       </w:pPr>
       <w:bookmarkStart w:id="65" w:name="_Toc230120377"/>
       <w:bookmarkStart w:id="66" w:name="_Toc230197672"/>
-      <w:bookmarkStart w:id="67" w:name="_Toc230369157"/>
+      <w:bookmarkStart w:id="67" w:name="_Toc230376309"/>
       <w:r>
         <w:rPr>
           <w:sz w:val="28"/>
@@ -8768,7 +9005,7 @@
       </w:pPr>
       <w:bookmarkStart w:id="68" w:name="_Toc230120378"/>
       <w:bookmarkStart w:id="69" w:name="_Toc230197673"/>
-      <w:bookmarkStart w:id="70" w:name="_Toc230369158"/>
+      <w:bookmarkStart w:id="70" w:name="_Toc230376310"/>
       <w:r>
         <w:rPr>
           <w:sz w:val="28"/>
@@ -8805,7 +9042,7 @@
       </w:pPr>
       <w:bookmarkStart w:id="71" w:name="_Toc230120379"/>
       <w:bookmarkStart w:id="72" w:name="_Toc230197674"/>
-      <w:bookmarkStart w:id="73" w:name="_Toc230369159"/>
+      <w:bookmarkStart w:id="73" w:name="_Toc230376311"/>
       <w:r>
         <w:rPr>
           <w:sz w:val="28"/>
@@ -8841,7 +9078,7 @@
       </w:pPr>
       <w:bookmarkStart w:id="74" w:name="_Toc230120380"/>
       <w:bookmarkStart w:id="75" w:name="_Toc230197675"/>
-      <w:bookmarkStart w:id="76" w:name="_Toc230369160"/>
+      <w:bookmarkStart w:id="76" w:name="_Toc230376312"/>
       <w:r>
         <w:rPr>
           <w:sz w:val="28"/>
@@ -8877,7 +9114,7 @@
       </w:pPr>
       <w:bookmarkStart w:id="77" w:name="_Toc230120381"/>
       <w:bookmarkStart w:id="78" w:name="_Toc230197676"/>
-      <w:bookmarkStart w:id="79" w:name="_Toc230369161"/>
+      <w:bookmarkStart w:id="79" w:name="_Toc230376313"/>
       <w:r>
         <w:rPr>
           <w:sz w:val="28"/>
@@ -8987,7 +9224,7 @@
       </w:pPr>
       <w:bookmarkStart w:id="80" w:name="_Toc230120382"/>
       <w:bookmarkStart w:id="81" w:name="_Toc230197677"/>
-      <w:bookmarkStart w:id="82" w:name="_Toc230369162"/>
+      <w:bookmarkStart w:id="82" w:name="_Toc230376314"/>
       <w:r>
         <w:rPr>
           <w:sz w:val="28"/>
@@ -9702,7 +9939,7 @@
       </w:pPr>
       <w:bookmarkStart w:id="83" w:name="_Toc230120383"/>
       <w:bookmarkStart w:id="84" w:name="_Toc230197678"/>
-      <w:bookmarkStart w:id="85" w:name="_Toc230369163"/>
+      <w:bookmarkStart w:id="85" w:name="_Toc230376315"/>
       <w:r>
         <w:rPr>
           <w:rFonts w:ascii="Arial" w:hAnsi="Arial" w:cs="Arial"/>
@@ -9727,7 +9964,7 @@
       </w:pPr>
       <w:bookmarkStart w:id="86" w:name="_Toc230120384"/>
       <w:bookmarkStart w:id="87" w:name="_Toc230197679"/>
-      <w:bookmarkStart w:id="88" w:name="_Toc230369164"/>
+      <w:bookmarkStart w:id="88" w:name="_Toc230376316"/>
       <w:r>
         <w:rPr>
           <w:rFonts w:ascii="Arial" w:hAnsi="Arial" w:cs="Arial"/>
@@ -9753,7 +9990,7 @@
       </w:pPr>
       <w:bookmarkStart w:id="89" w:name="_Toc230120385"/>
       <w:bookmarkStart w:id="90" w:name="_Toc230197680"/>
-      <w:bookmarkStart w:id="91" w:name="_Toc230369165"/>
+      <w:bookmarkStart w:id="91" w:name="_Toc230376317"/>
       <w:r>
         <w:rPr>
           <w:rFonts w:ascii="Arial" w:hAnsi="Arial" w:cs="Arial"/>
@@ -9999,6 +10236,61 @@
       </w:r>
     </w:p>
     <w:p>
+      <w:r>
+        <w:t>La Figura 4-1 resume los componentes principales de la solucion implementada: cliente web, aplicacion Flask, blueprints funcionales, servicios auxiliares, persistencia y modulo de Machine Learning.</w:t>
+      </w:r>
+    </w:p>
+    <w:p>
+      <w:r>
+        <w:rPr>
+          <w:noProof/>
+        </w:rPr>
+        <w:drawing>
+          <wp:inline distT="0" distB="0" distL="0" distR="0" wp14:anchorId="6603AA07" wp14:editId="359EBD23">
+            <wp:extent cx="5806440" cy="1496801"/>
+            <wp:effectExtent l="0" t="0" r="0" b="0"/>
+            <wp:docPr id="9" name="Picture 9"/>
+            <wp:cNvGraphicFramePr>
+              <a:graphicFrameLocks xmlns:a="http://schemas.openxmlformats.org/drawingml/2006/main" noChangeAspect="1"/>
+            </wp:cNvGraphicFramePr>
+            <a:graphic xmlns:a="http://schemas.openxmlformats.org/drawingml/2006/main">
+              <a:graphicData uri="http://schemas.openxmlformats.org/drawingml/2006/picture">
+                <pic:pic xmlns:pic="http://schemas.openxmlformats.org/drawingml/2006/picture">
+                  <pic:nvPicPr>
+                    <pic:cNvPr id="0" name="03_componentes.png"/>
+                    <pic:cNvPicPr/>
+                  </pic:nvPicPr>
+                  <pic:blipFill>
+                    <a:blip r:embed="rId27"/>
+                    <a:stretch>
+                      <a:fillRect/>
+                    </a:stretch>
+                  </pic:blipFill>
+                  <pic:spPr>
+                    <a:xfrm>
+                      <a:off x="0" y="0"/>
+                      <a:ext cx="5806440" cy="1496801"/>
+                    </a:xfrm>
+                    <a:prstGeom prst="rect">
+                      <a:avLst/>
+                    </a:prstGeom>
+                  </pic:spPr>
+                </pic:pic>
+              </a:graphicData>
+            </a:graphic>
+          </wp:inline>
+        </w:drawing>
+      </w:r>
+    </w:p>
+    <w:p>
+      <w:pPr>
+        <w:pStyle w:val="Descripcin"/>
+      </w:pPr>
+      <w:r>
+        <w:t>Figura 4-1. Diagrama de componentes de TPScouting.</w:t>
+      </w:r>
+    </w:p>
+    <w:p>
       <w:pPr>
         <w:spacing w:before="100" w:beforeAutospacing="1"/>
         <w:ind w:left="720"/>
@@ -10094,7 +10386,17 @@
           <w:szCs w:val="28"/>
           <w:lang w:val="es-ES"/>
         </w:rPr>
-        <w:t>Microframework: Flask es un framework pequeño y flexible. No incluye herramientas complejas por defecto, lo que lo hace ideal para aplicaciones pequeñas o medianas, aunque también es lo suficientemente escalable para aplicaciones más grandes.</w:t>
+        <w:t xml:space="preserve">Microframework: Flask es un framework pequeño y flexible. No incluye herramientas complejas por defecto, lo que lo hace ideal </w:t>
+      </w:r>
+      <w:r>
+        <w:rPr>
+          <w:rFonts w:cs="Arial"/>
+          <w:sz w:val="28"/>
+          <w:szCs w:val="28"/>
+          <w:lang w:val="es-ES"/>
+        </w:rPr>
+        <w:lastRenderedPageBreak/>
+        <w:t>para aplicaciones pequeñas o medianas, aunque también es lo suficientemente escalable para aplicaciones más grandes.</w:t>
       </w:r>
     </w:p>
     <w:p>
@@ -10142,17 +10444,7 @@
           <w:szCs w:val="28"/>
           <w:lang w:val="es-ES"/>
         </w:rPr>
-        <w:t xml:space="preserve">Extensible: Aunque Flask tiene un núcleo ligero, se puede expandir fácilmente mediante extensiones. Estas extensiones permiten añadir funcionalidades como gestión de base de datos, </w:t>
-      </w:r>
-      <w:r>
-        <w:rPr>
-          <w:rFonts w:cs="Arial"/>
-          <w:sz w:val="28"/>
-          <w:szCs w:val="28"/>
-          <w:lang w:val="es-ES"/>
-        </w:rPr>
-        <w:lastRenderedPageBreak/>
-        <w:t>autenticación, formularios, etc., sin que el framework pierda su simplicidad.</w:t>
+        <w:t>Extensible: Aunque Flask tiene un núcleo ligero, se puede expandir fácilmente mediante extensiones. Estas extensiones permiten añadir funcionalidades como gestión de base de datos, autenticación, formularios, etc., sin que el framework pierda su simplicidad.</w:t>
       </w:r>
     </w:p>
     <w:p>
@@ -10278,6 +10570,7 @@
           <w:szCs w:val="28"/>
           <w:lang w:val="es-ES"/>
         </w:rPr>
+        <w:lastRenderedPageBreak/>
         <w:t>API RESTful: Debido a su flexibilidad y simplicidad, Flask es ampliamente utilizado para crear APIs RESTful. Permite a los desarrolladores construir servicios que pueden ser consumidos por otros servicios o aplicaciones front-end.</w:t>
       </w:r>
     </w:p>
@@ -10326,17 +10619,7 @@
           <w:szCs w:val="28"/>
           <w:lang w:val="es-ES"/>
         </w:rPr>
-        <w:t xml:space="preserve">Integración con otras tecnologías: Se puede integrar fácilmente con bases de datos relacionales como SQL o no relacionales como MongoDB. Además, es compatible con motores de </w:t>
-      </w:r>
-      <w:r>
-        <w:rPr>
-          <w:rFonts w:cs="Arial"/>
-          <w:sz w:val="28"/>
-          <w:szCs w:val="28"/>
-          <w:lang w:val="es-ES"/>
-        </w:rPr>
-        <w:lastRenderedPageBreak/>
-        <w:t>plantillas como Jinja2, que facilita la creación de interfaces de usuario dinámicas.</w:t>
+        <w:t>Integración con otras tecnologías: Se puede integrar fácilmente con bases de datos relacionales como SQL o no relacionales como MongoDB. Además, es compatible con motores de plantillas como Jinja2, que facilita la creación de interfaces de usuario dinámicas.</w:t>
       </w:r>
     </w:p>
     <w:p>
@@ -10449,6 +10732,7 @@
           <w:szCs w:val="28"/>
           <w:lang w:val="es-ES"/>
         </w:rPr>
+        <w:lastRenderedPageBreak/>
         <w:t>Ahora, compararemos Flask con un framework similar en el ecosistema .NET, que es .NET Core Minimal APIs. Este enfoque de .NET es un equivalente en términos de simplicidad y ligereza a Flask, ya que también proporciona un marco básico para construir servicios web rápidos y minimalistas sin sobrecargar al desarrollador con funcionalidades complejas desde el principio.</w:t>
       </w:r>
     </w:p>
@@ -10516,7 +10800,6 @@
           <w:szCs w:val="28"/>
           <w:lang w:val="es-ES"/>
         </w:rPr>
-        <w:lastRenderedPageBreak/>
         <w:t>Enfoque: Es extremadamente minimalista y solo proporciona lo esencial para iniciar una aplicación web o API RESTful. La mayoría de las funcionalidades adicionales (como autenticación, manejo de formularios, etc.) se agregan mediante extensiones.</w:t>
       </w:r>
     </w:p>
@@ -10637,6 +10920,7 @@
           <w:szCs w:val="28"/>
           <w:lang w:val="es-ES"/>
         </w:rPr>
+        <w:lastRenderedPageBreak/>
         <w:t>Despliegue: Desplegar Flask es relativamente sencillo. Se puede ejecutar fácilmente en servidores estándar como Apache o Nginx con Gunicorn o uWSGI.</w:t>
       </w:r>
     </w:p>
@@ -10680,7 +10964,6 @@
           <w:sz w:val="28"/>
           <w:szCs w:val="28"/>
         </w:rPr>
-        <w:lastRenderedPageBreak/>
         <w:t>4.1.1.2 .NET Core Minimal APIs (C#)</w:t>
       </w:r>
     </w:p>
@@ -10801,7 +11084,17 @@
           <w:szCs w:val="28"/>
           <w:lang w:val="es-ES"/>
         </w:rPr>
-        <w:t>Facilidad de uso: Aunque C# y .NET son generalmente más complejos que Python, las Minimal APIs han simplificado bastante la creación de servicios web en el ecosistema .NET, haciendo que sea bastante fácil de aprender para los desarrolladores familiarizados con el lenguaje.</w:t>
+        <w:t xml:space="preserve">Facilidad de uso: Aunque C# y .NET son generalmente más complejos que Python, las Minimal APIs han simplificado bastante la creación de servicios web en el ecosistema .NET, </w:t>
+      </w:r>
+      <w:r>
+        <w:rPr>
+          <w:rFonts w:cs="Arial"/>
+          <w:sz w:val="28"/>
+          <w:szCs w:val="28"/>
+          <w:lang w:val="es-ES"/>
+        </w:rPr>
+        <w:lastRenderedPageBreak/>
+        <w:t>haciendo que sea bastante fácil de aprender para los desarrolladores familiarizados con el lenguaje.</w:t>
       </w:r>
     </w:p>
     <w:p>
@@ -10849,7 +11142,6 @@
           <w:szCs w:val="28"/>
           <w:lang w:val="es-ES"/>
         </w:rPr>
-        <w:lastRenderedPageBreak/>
         <w:t>Despliegue: .NET Core es multiplataforma, por lo que las aplicaciones pueden ejecutarse en Windows, Linux y macOS, con soporte fácil para Docker y Kubernetes.</w:t>
       </w:r>
     </w:p>
@@ -11293,6 +11585,7 @@
                 <w:sz w:val="28"/>
                 <w:szCs w:val="28"/>
               </w:rPr>
+              <w:lastRenderedPageBreak/>
               <w:t>Componentes opcionales</w:t>
             </w:r>
           </w:p>
@@ -11441,7 +11734,6 @@
                 <w:sz w:val="28"/>
                 <w:szCs w:val="28"/>
               </w:rPr>
-              <w:lastRenderedPageBreak/>
               <w:t>Facilidad de despliegue</w:t>
             </w:r>
           </w:p>
@@ -11674,6 +11966,7 @@
           <w:szCs w:val="28"/>
           <w:lang w:val="es-ES"/>
         </w:rPr>
+        <w:lastRenderedPageBreak/>
         <w:t>SQLAlchemy ORM en Flask: en esta implementación se configura mediante create_engine y sessionmaker, manteniendo control explícito de sesiones, consultas y transacciones sobre una base relacional.</w:t>
       </w:r>
     </w:p>
@@ -11723,7 +12016,6 @@
           <w:szCs w:val="28"/>
           <w:lang w:val="es-ES"/>
         </w:rPr>
-        <w:lastRenderedPageBreak/>
         <w:t>ORM (Object-Relational Mapping): SQLAlchemy permite interactuar con bases de datos utilizando clases y objetos en lugar de escribir consultas SQL manualmente. Esto hace que el código sea más limpio, mantenible y trazable.</w:t>
       </w:r>
     </w:p>
@@ -11852,6 +12144,7 @@
           <w:szCs w:val="28"/>
           <w:lang w:val="es-ES"/>
         </w:rPr>
+        <w:lastRenderedPageBreak/>
         <w:t>Integración sencilla con Flask: La configuración es muy simple dentro de Flask, generalmente solo necesitas definir la cadena de conexión de la base de datos en tu configuración y vincular la instancia de SQLAlchemy a tu aplicación Flask.</w:t>
       </w:r>
     </w:p>
@@ -11897,7 +12190,6 @@
           <w:szCs w:val="28"/>
           <w:lang w:val="es-ES"/>
         </w:rPr>
-        <w:lastRenderedPageBreak/>
         <w:t>Peewee es otro ORM popular en Python que suele utilizarse en proyectos que buscan una opción más liviana. En este trabajo, SQLAlchemy se prioriza por robustez y escalabilidad dentro del MVP.</w:t>
       </w:r>
     </w:p>
@@ -12230,6 +12522,7 @@
                 <w:sz w:val="28"/>
                 <w:szCs w:val="28"/>
               </w:rPr>
+              <w:lastRenderedPageBreak/>
               <w:t>Sistema de migraciones</w:t>
             </w:r>
           </w:p>
@@ -12305,7 +12598,6 @@
                 <w:sz w:val="28"/>
                 <w:szCs w:val="28"/>
               </w:rPr>
-              <w:lastRenderedPageBreak/>
               <w:t>Relaciones entre tablas</w:t>
             </w:r>
           </w:p>
@@ -12606,6 +12898,7 @@
           <w:szCs w:val="28"/>
           <w:lang w:val="es-ES"/>
         </w:rPr>
+        <w:lastRenderedPageBreak/>
         <w:t>Flexibilidad: Ya que se desea tener control completo sobre las consultas y cómo interactúas con la base de datos.</w:t>
       </w:r>
     </w:p>
@@ -12678,7 +12971,6 @@
           <w:szCs w:val="28"/>
           <w:lang w:val="es-ES"/>
         </w:rPr>
-        <w:lastRenderedPageBreak/>
         <w:t>Simplicidad: Si no se necesitan todas las funcionalidades avanzadas que ofrece SQLAlchemy, Peewee puede resultar una interfaz más sencilla y menos sobrecargada.</w:t>
       </w:r>
     </w:p>
@@ -12774,7 +13066,7 @@
       </w:pPr>
       <w:bookmarkStart w:id="100" w:name="_Toc230120386"/>
       <w:bookmarkStart w:id="101" w:name="_Toc230197689"/>
-      <w:bookmarkStart w:id="102" w:name="_Toc230369166"/>
+      <w:bookmarkStart w:id="102" w:name="_Toc230376318"/>
       <w:r>
         <w:rPr>
           <w:rFonts w:ascii="Arial" w:hAnsi="Arial" w:cs="Arial"/>
@@ -12832,6 +13124,7 @@
           <w:sz w:val="28"/>
           <w:szCs w:val="28"/>
         </w:rPr>
+        <w:lastRenderedPageBreak/>
         <w:t>Tablas principales:</w:t>
       </w:r>
     </w:p>
@@ -12880,7 +13173,6 @@
           <w:szCs w:val="28"/>
           <w:lang w:val="es-ES"/>
         </w:rPr>
-        <w:lastRenderedPageBreak/>
         <w:t>player_stats (PlayerStat): registra estadísticas por fecha (partidos/microciclos), incluyendo minutos, goles, asistencias y score final.</w:t>
       </w:r>
     </w:p>
@@ -13276,6 +13568,7 @@
                 <w:sz w:val="28"/>
                 <w:szCs w:val="28"/>
               </w:rPr>
+              <w:lastRenderedPageBreak/>
               <w:t>Rendimiento en consultas complejas</w:t>
             </w:r>
           </w:p>
@@ -13376,7 +13669,6 @@
                 <w:sz w:val="28"/>
                 <w:szCs w:val="28"/>
               </w:rPr>
-              <w:lastRenderedPageBreak/>
               <w:t>Soporte para Python</w:t>
             </w:r>
           </w:p>
@@ -13608,7 +13900,7 @@
       </w:pPr>
       <w:bookmarkStart w:id="103" w:name="_Toc230120387"/>
       <w:bookmarkStart w:id="104" w:name="_Toc230197690"/>
-      <w:bookmarkStart w:id="105" w:name="_Toc230369167"/>
+      <w:bookmarkStart w:id="105" w:name="_Toc230376319"/>
       <w:r>
         <w:rPr>
           <w:rFonts w:ascii="Arial" w:hAnsi="Arial" w:cs="Arial"/>
@@ -13616,6 +13908,7 @@
           <w:szCs w:val="28"/>
           <w:lang w:val="es-ES"/>
         </w:rPr>
+        <w:lastRenderedPageBreak/>
         <w:t xml:space="preserve">4.1.3 </w:t>
       </w:r>
       <w:r>
@@ -13676,7 +13969,6 @@
           <w:szCs w:val="28"/>
           <w:lang w:val="es-ES"/>
         </w:rPr>
-        <w:lastRenderedPageBreak/>
         <w:t>Una Landing Page con un login, que permite a los usuarios ingresar al sistema y acceder al panel de control donde pueden gestionar jugadores, ver estadísticas y generar proyecciones.</w:t>
       </w:r>
     </w:p>
@@ -13787,7 +14079,7 @@
       </w:pPr>
       <w:bookmarkStart w:id="106" w:name="_Toc230120388"/>
       <w:bookmarkStart w:id="107" w:name="_Toc230197691"/>
-      <w:bookmarkStart w:id="108" w:name="_Toc230369168"/>
+      <w:bookmarkStart w:id="108" w:name="_Toc230376320"/>
       <w:r>
         <w:rPr>
           <w:rFonts w:ascii="Arial" w:hAnsi="Arial" w:cs="Arial"/>
@@ -13810,7 +14102,7 @@
       </w:pPr>
       <w:bookmarkStart w:id="109" w:name="_Toc230120389"/>
       <w:bookmarkStart w:id="110" w:name="_Toc230197692"/>
-      <w:bookmarkStart w:id="111" w:name="_Toc230369169"/>
+      <w:bookmarkStart w:id="111" w:name="_Toc230376321"/>
       <w:r>
         <w:rPr>
           <w:sz w:val="28"/>
@@ -13894,6 +14186,7 @@
           <w:sz w:val="28"/>
           <w:szCs w:val="28"/>
         </w:rPr>
+        <w:lastRenderedPageBreak/>
         <w:t>• Comparador 1v1 y comparador múltiple con métricas visuales.</w:t>
       </w:r>
     </w:p>
@@ -13922,13 +14215,12 @@
       </w:pPr>
       <w:bookmarkStart w:id="112" w:name="_Toc230120390"/>
       <w:bookmarkStart w:id="113" w:name="_Toc230197693"/>
-      <w:bookmarkStart w:id="114" w:name="_Toc230369170"/>
-      <w:r>
-        <w:rPr>
-          <w:sz w:val="28"/>
-          <w:szCs w:val="28"/>
-        </w:rPr>
-        <w:lastRenderedPageBreak/>
+      <w:bookmarkStart w:id="114" w:name="_Toc230376322"/>
+      <w:r>
+        <w:rPr>
+          <w:sz w:val="28"/>
+          <w:szCs w:val="28"/>
+        </w:rPr>
         <w:t>4.2.2 Modelo de evaluación deportiva</w:t>
       </w:r>
       <w:bookmarkEnd w:id="112"/>
@@ -14308,7 +14600,15 @@
                 <w:sz w:val="28"/>
                 <w:szCs w:val="28"/>
               </w:rPr>
-              <w:t>minutos, goles, asistencias, precisión, puntaje final</w:t>
+              <w:t xml:space="preserve">minutos, goles, asistencias, </w:t>
+            </w:r>
+            <w:r>
+              <w:rPr>
+                <w:sz w:val="28"/>
+                <w:szCs w:val="28"/>
+              </w:rPr>
+              <w:lastRenderedPageBreak/>
+              <w:t>precisión, puntaje final</w:t>
             </w:r>
           </w:p>
         </w:tc>
@@ -14328,6 +14628,7 @@
                 <w:sz w:val="28"/>
                 <w:szCs w:val="28"/>
               </w:rPr>
+              <w:lastRenderedPageBreak/>
               <w:t>Historial de partidos/entrenamientos</w:t>
             </w:r>
           </w:p>
@@ -14352,13 +14653,12 @@
       </w:pPr>
       <w:bookmarkStart w:id="115" w:name="_Toc230120391"/>
       <w:bookmarkStart w:id="116" w:name="_Toc230197694"/>
-      <w:bookmarkStart w:id="117" w:name="_Toc230369171"/>
-      <w:r>
-        <w:rPr>
-          <w:sz w:val="28"/>
-          <w:szCs w:val="28"/>
-        </w:rPr>
-        <w:lastRenderedPageBreak/>
+      <w:bookmarkStart w:id="117" w:name="_Toc230376323"/>
+      <w:r>
+        <w:rPr>
+          <w:sz w:val="28"/>
+          <w:szCs w:val="28"/>
+        </w:rPr>
         <w:t>4.2.3 Uso de PyTorch y Scikit-learn</w:t>
       </w:r>
       <w:bookmarkEnd w:id="115"/>
@@ -14390,7 +14690,7 @@
       </w:pPr>
       <w:bookmarkStart w:id="118" w:name="_Toc230120392"/>
       <w:bookmarkStart w:id="119" w:name="_Toc230197695"/>
-      <w:bookmarkStart w:id="120" w:name="_Toc230369172"/>
+      <w:bookmarkStart w:id="120" w:name="_Toc230376324"/>
       <w:r>
         <w:rPr>
           <w:sz w:val="28"/>
@@ -14442,7 +14742,7 @@
       </w:pPr>
       <w:bookmarkStart w:id="121" w:name="_Toc230120393"/>
       <w:bookmarkStart w:id="122" w:name="_Toc230197696"/>
-      <w:bookmarkStart w:id="123" w:name="_Toc230369173"/>
+      <w:bookmarkStart w:id="123" w:name="_Toc230376325"/>
       <w:r>
         <w:rPr>
           <w:sz w:val="28"/>
@@ -14466,7 +14766,15 @@
           <w:sz w:val="28"/>
           <w:szCs w:val="28"/>
         </w:rPr>
-        <w:t>La arquitectura actual es una aplicación Flask server-side con Jinja2 y Bootstrap en frontend, SQLAlchemy como ORM, SQLite para desarrollo local y PostgreSQL en Render para demo pública. El backend fue modularizado parcialmente mediante blueprints por familia: auth, staff, players, dashboard, compare y settings. La inferencia ML se encapsula en módulos de runtime, manteniendo compatibilidad con los endpoints existentes.</w:t>
+        <w:t xml:space="preserve">La arquitectura actual es una aplicación Flask server-side con Jinja2 y Bootstrap en frontend, SQLAlchemy como ORM, SQLite para desarrollo local y PostgreSQL en Render para demo pública. El backend fue modularizado parcialmente mediante blueprints por familia: auth, staff, players, dashboard, compare y settings. La </w:t>
+      </w:r>
+      <w:r>
+        <w:rPr>
+          <w:sz w:val="28"/>
+          <w:szCs w:val="28"/>
+        </w:rPr>
+        <w:lastRenderedPageBreak/>
+        <w:t>inferencia ML se encapsula en módulos de runtime, manteniendo compatibilidad con los endpoints existentes.</w:t>
       </w:r>
     </w:p>
     <w:tbl>
@@ -14559,7 +14867,6 @@
                 <w:sz w:val="28"/>
                 <w:szCs w:val="28"/>
               </w:rPr>
-              <w:lastRenderedPageBreak/>
               <w:t>Presentación</w:t>
             </w:r>
           </w:p>
@@ -14933,7 +15240,7 @@
       </w:pPr>
       <w:bookmarkStart w:id="124" w:name="_Toc230120394"/>
       <w:bookmarkStart w:id="125" w:name="_Toc230197697"/>
-      <w:bookmarkStart w:id="126" w:name="_Toc230369174"/>
+      <w:bookmarkStart w:id="126" w:name="_Toc230376326"/>
       <w:r>
         <w:rPr>
           <w:sz w:val="28"/>
@@ -15096,6 +15403,7 @@
                 <w:sz w:val="28"/>
                 <w:szCs w:val="28"/>
               </w:rPr>
+              <w:lastRenderedPageBreak/>
               <w:t>RF-02</w:t>
             </w:r>
           </w:p>
@@ -15116,15 +15424,7 @@
                 <w:sz w:val="28"/>
                 <w:szCs w:val="28"/>
               </w:rPr>
-              <w:t xml:space="preserve">Gestión de usuarios con roles </w:t>
-            </w:r>
-            <w:r>
-              <w:rPr>
-                <w:sz w:val="28"/>
-                <w:szCs w:val="28"/>
-              </w:rPr>
-              <w:lastRenderedPageBreak/>
-              <w:t>administrador, scout y director.</w:t>
+              <w:t>Gestión de usuarios con roles administrador, scout y director.</w:t>
             </w:r>
           </w:p>
         </w:tc>
@@ -15144,7 +15444,6 @@
                 <w:sz w:val="28"/>
                 <w:szCs w:val="28"/>
               </w:rPr>
-              <w:lastRenderedPageBreak/>
               <w:t>Implementado</w:t>
             </w:r>
           </w:p>
@@ -15539,6 +15838,7 @@
                 <w:sz w:val="28"/>
                 <w:szCs w:val="28"/>
               </w:rPr>
+              <w:lastRenderedPageBreak/>
               <w:t>RF-09</w:t>
             </w:r>
           </w:p>
@@ -15601,7 +15901,6 @@
                 <w:sz w:val="28"/>
                 <w:szCs w:val="28"/>
               </w:rPr>
-              <w:lastRenderedPageBreak/>
               <w:t>RF-10</w:t>
             </w:r>
           </w:p>
@@ -15789,7 +16088,7 @@
       </w:pPr>
       <w:bookmarkStart w:id="127" w:name="_Toc230120395"/>
       <w:bookmarkStart w:id="128" w:name="_Toc230197698"/>
-      <w:bookmarkStart w:id="129" w:name="_Toc230369175"/>
+      <w:bookmarkStart w:id="129" w:name="_Toc230376327"/>
       <w:r>
         <w:rPr>
           <w:sz w:val="28"/>
@@ -16010,6 +16309,7 @@
                 <w:sz w:val="28"/>
                 <w:szCs w:val="28"/>
               </w:rPr>
+              <w:lastRenderedPageBreak/>
               <w:t>Match / PlayerMatchParticipation</w:t>
             </w:r>
           </w:p>
@@ -16052,7 +16352,6 @@
                 <w:sz w:val="28"/>
                 <w:szCs w:val="28"/>
               </w:rPr>
-              <w:lastRenderedPageBreak/>
               <w:t>PhysicalAssessment</w:t>
             </w:r>
           </w:p>
@@ -16214,6 +16513,61 @@
       </w:r>
     </w:p>
     <w:p>
+      <w:r>
+        <w:t>La Figura 4-2 muestra las clases principales del modelo de dominio persistido con SQLAlchemy y sus relaciones mas relevantes.</w:t>
+      </w:r>
+    </w:p>
+    <w:p>
+      <w:r>
+        <w:rPr>
+          <w:noProof/>
+        </w:rPr>
+        <w:drawing>
+          <wp:inline distT="0" distB="0" distL="0" distR="0" wp14:anchorId="25CAC574" wp14:editId="6F05AF88">
+            <wp:extent cx="5806440" cy="2880015"/>
+            <wp:effectExtent l="0" t="0" r="0" b="0"/>
+            <wp:docPr id="10" name="Picture 10"/>
+            <wp:cNvGraphicFramePr>
+              <a:graphicFrameLocks xmlns:a="http://schemas.openxmlformats.org/drawingml/2006/main" noChangeAspect="1"/>
+            </wp:cNvGraphicFramePr>
+            <a:graphic xmlns:a="http://schemas.openxmlformats.org/drawingml/2006/main">
+              <a:graphicData uri="http://schemas.openxmlformats.org/drawingml/2006/picture">
+                <pic:pic xmlns:pic="http://schemas.openxmlformats.org/drawingml/2006/picture">
+                  <pic:nvPicPr>
+                    <pic:cNvPr id="0" name="05_clases.png"/>
+                    <pic:cNvPicPr/>
+                  </pic:nvPicPr>
+                  <pic:blipFill>
+                    <a:blip r:embed="rId28"/>
+                    <a:stretch>
+                      <a:fillRect/>
+                    </a:stretch>
+                  </pic:blipFill>
+                  <pic:spPr>
+                    <a:xfrm>
+                      <a:off x="0" y="0"/>
+                      <a:ext cx="5806440" cy="2880015"/>
+                    </a:xfrm>
+                    <a:prstGeom prst="rect">
+                      <a:avLst/>
+                    </a:prstGeom>
+                  </pic:spPr>
+                </pic:pic>
+              </a:graphicData>
+            </a:graphic>
+          </wp:inline>
+        </w:drawing>
+      </w:r>
+    </w:p>
+    <w:p>
+      <w:pPr>
+        <w:pStyle w:val="Descripcin"/>
+      </w:pPr>
+      <w:r>
+        <w:t>Figura 4-2. Diagrama de clases del modelo de dominio.</w:t>
+      </w:r>
+    </w:p>
+    <w:p>
       <w:pPr>
         <w:pStyle w:val="Ttulo2"/>
         <w:rPr>
@@ -16222,7 +16576,7 @@
       </w:pPr>
       <w:bookmarkStart w:id="130" w:name="_Toc230120396"/>
       <w:bookmarkStart w:id="131" w:name="_Toc230197699"/>
-      <w:bookmarkStart w:id="132" w:name="_Toc230369176"/>
+      <w:bookmarkStart w:id="132" w:name="_Toc230376328"/>
       <w:r>
         <w:rPr>
           <w:sz w:val="28"/>
@@ -16385,6 +16739,7 @@
                 <w:sz w:val="28"/>
                 <w:szCs w:val="28"/>
               </w:rPr>
+              <w:lastRenderedPageBreak/>
               <w:t>POST</w:t>
             </w:r>
           </w:p>
@@ -16819,7 +17174,6 @@
                 <w:sz w:val="28"/>
                 <w:szCs w:val="28"/>
               </w:rPr>
-              <w:lastRenderedPageBreak/>
               <w:t>GET/POST</w:t>
             </w:r>
           </w:p>
@@ -17193,11 +17547,12 @@
       </w:pPr>
       <w:bookmarkStart w:id="133" w:name="_Toc230120397"/>
       <w:bookmarkStart w:id="134" w:name="_Toc230197700"/>
-      <w:bookmarkStart w:id="135" w:name="_Toc230369177"/>
-      <w:r>
-        <w:rPr>
-          <w:sz w:val="28"/>
-        </w:rPr>
+      <w:bookmarkStart w:id="135" w:name="_Toc230376329"/>
+      <w:r>
+        <w:rPr>
+          <w:sz w:val="28"/>
+        </w:rPr>
+        <w:lastRenderedPageBreak/>
         <w:t>4.6 Decisiones tecnológicas y alineación con el MVP</w:t>
       </w:r>
       <w:bookmarkEnd w:id="133"/>
@@ -17441,7 +17796,6 @@
                 <w:sz w:val="28"/>
                 <w:szCs w:val="28"/>
               </w:rPr>
-              <w:lastRenderedPageBreak/>
               <w:t>Bootstrap/Jinja2</w:t>
             </w:r>
           </w:p>
@@ -17611,7 +17965,7 @@
       </w:pPr>
       <w:bookmarkStart w:id="136" w:name="_Toc230120398"/>
       <w:bookmarkStart w:id="137" w:name="_Toc230197701"/>
-      <w:bookmarkStart w:id="138" w:name="_Toc230369178"/>
+      <w:bookmarkStart w:id="138" w:name="_Toc230376330"/>
       <w:r>
         <w:rPr>
           <w:sz w:val="28"/>
@@ -17733,6 +18087,7 @@
                 <w:sz w:val="28"/>
                 <w:szCs w:val="28"/>
               </w:rPr>
+              <w:lastRenderedPageBreak/>
               <w:t>CU-01</w:t>
             </w:r>
           </w:p>
@@ -18039,15 +18394,7 @@
                 <w:sz w:val="28"/>
                 <w:szCs w:val="28"/>
               </w:rPr>
-              <w:t xml:space="preserve">Datos operativos </w:t>
-            </w:r>
-            <w:r>
-              <w:rPr>
-                <w:sz w:val="28"/>
-                <w:szCs w:val="28"/>
-              </w:rPr>
-              <w:lastRenderedPageBreak/>
-              <w:t>visibles en ficha y dashboard.</w:t>
+              <w:t>Datos operativos visibles en ficha y dashboard.</w:t>
             </w:r>
           </w:p>
         </w:tc>
@@ -18069,7 +18416,6 @@
                 <w:sz w:val="28"/>
                 <w:szCs w:val="28"/>
               </w:rPr>
-              <w:lastRenderedPageBreak/>
               <w:t>CU-05</w:t>
             </w:r>
           </w:p>
@@ -18234,6 +18580,7 @@
                 <w:sz w:val="28"/>
                 <w:szCs w:val="28"/>
               </w:rPr>
+              <w:lastRenderedPageBreak/>
               <w:t>CU-07</w:t>
             </w:r>
           </w:p>
@@ -18309,11 +18656,196 @@
       </w:r>
     </w:p>
     <w:p>
+      <w:r>
+        <w:t xml:space="preserve">La Figura 4-3 </w:t>
+      </w:r>
+      <w:r>
+        <w:t>resume los casos de uso principales del sistema, agrupando los roles de administrador, scout, director y el sistema de Machine Learning.</w:t>
+      </w:r>
+    </w:p>
+    <w:p>
+      <w:pPr>
+        <w:jc w:val="center"/>
+      </w:pPr>
+      <w:r>
+        <w:rPr>
+          <w:noProof/>
+        </w:rPr>
+        <w:drawing>
+          <wp:inline distT="0" distB="0" distL="0" distR="0" wp14:anchorId="482BDDAE" wp14:editId="55E43DFE">
+            <wp:extent cx="5394960" cy="5618249"/>
+            <wp:effectExtent l="0" t="0" r="0" b="0"/>
+            <wp:docPr id="19" name="Picture 19"/>
+            <wp:cNvGraphicFramePr>
+              <a:graphicFrameLocks xmlns:a="http://schemas.openxmlformats.org/drawingml/2006/main" noChangeAspect="1"/>
+            </wp:cNvGraphicFramePr>
+            <a:graphic xmlns:a="http://schemas.openxmlformats.org/drawingml/2006/main">
+              <a:graphicData uri="http://schemas.openxmlformats.org/drawingml/2006/picture">
+                <pic:pic xmlns:pic="http://schemas.openxmlformats.org/drawingml/2006/picture">
+                  <pic:nvPicPr>
+                    <pic:cNvPr id="0" name="06_casos_uso_general.png"/>
+                    <pic:cNvPicPr/>
+                  </pic:nvPicPr>
+                  <pic:blipFill>
+                    <a:blip r:embed="rId29"/>
+                    <a:stretch>
+                      <a:fillRect/>
+                    </a:stretch>
+                  </pic:blipFill>
+                  <pic:spPr>
+                    <a:xfrm>
+                      <a:off x="0" y="0"/>
+                      <a:ext cx="5394960" cy="5618249"/>
+                    </a:xfrm>
+                    <a:prstGeom prst="rect">
+                      <a:avLst/>
+                    </a:prstGeom>
+                  </pic:spPr>
+                </pic:pic>
+              </a:graphicData>
+            </a:graphic>
+          </wp:inline>
+        </w:drawing>
+      </w:r>
+    </w:p>
+    <w:p>
+      <w:pPr>
+        <w:pStyle w:val="Descripcin"/>
+      </w:pPr>
+      <w:r>
+        <w:t>Figura 4-3. Diagrama de casos de uso general.</w:t>
+      </w:r>
+    </w:p>
+    <w:p>
+      <w:r>
+        <w:t>La Figura 4-4 detalla los casos de uso asociados a alta, edición, consu</w:t>
+      </w:r>
+      <w:r>
+        <w:t>lta, carga masiva e historiales de jugadores.</w:t>
+      </w:r>
+    </w:p>
+    <w:p>
+      <w:pPr>
+        <w:jc w:val="center"/>
+      </w:pPr>
+      <w:r>
+        <w:rPr>
+          <w:noProof/>
+        </w:rPr>
+        <w:lastRenderedPageBreak/>
+        <w:drawing>
+          <wp:inline distT="0" distB="0" distL="0" distR="0" wp14:anchorId="302B14B0" wp14:editId="7FC56E7D">
+            <wp:extent cx="3886200" cy="7381229"/>
+            <wp:effectExtent l="0" t="0" r="0" b="0"/>
+            <wp:docPr id="20" name="Picture 20"/>
+            <wp:cNvGraphicFramePr>
+              <a:graphicFrameLocks xmlns:a="http://schemas.openxmlformats.org/drawingml/2006/main" noChangeAspect="1"/>
+            </wp:cNvGraphicFramePr>
+            <a:graphic xmlns:a="http://schemas.openxmlformats.org/drawingml/2006/main">
+              <a:graphicData uri="http://schemas.openxmlformats.org/drawingml/2006/picture">
+                <pic:pic xmlns:pic="http://schemas.openxmlformats.org/drawingml/2006/picture">
+                  <pic:nvPicPr>
+                    <pic:cNvPr id="0" name="07_casos_uso_gestion_jugadores.png"/>
+                    <pic:cNvPicPr/>
+                  </pic:nvPicPr>
+                  <pic:blipFill>
+                    <a:blip r:embed="rId30"/>
+                    <a:stretch>
+                      <a:fillRect/>
+                    </a:stretch>
+                  </pic:blipFill>
+                  <pic:spPr>
+                    <a:xfrm>
+                      <a:off x="0" y="0"/>
+                      <a:ext cx="3886200" cy="7381229"/>
+                    </a:xfrm>
+                    <a:prstGeom prst="rect">
+                      <a:avLst/>
+                    </a:prstGeom>
+                  </pic:spPr>
+                </pic:pic>
+              </a:graphicData>
+            </a:graphic>
+          </wp:inline>
+        </w:drawing>
+      </w:r>
+    </w:p>
+    <w:p>
+      <w:pPr>
+        <w:pStyle w:val="Descripcin"/>
+      </w:pPr>
+      <w:r>
+        <w:t>Figura 4-4. Diagrama de casos de uso de gestión de jugadores.</w:t>
+      </w:r>
+    </w:p>
+    <w:p>
+      <w:r>
+        <w:t>La Figura 4-5 muestra los casos de uso orientados a consulta, comparación, panel general y predicción de potencial.</w:t>
+      </w:r>
+    </w:p>
+    <w:p>
+      <w:pPr>
+        <w:jc w:val="center"/>
+      </w:pPr>
+      <w:r>
+        <w:rPr>
+          <w:noProof/>
+        </w:rPr>
+        <w:lastRenderedPageBreak/>
+        <w:drawing>
+          <wp:inline distT="0" distB="0" distL="0" distR="0" wp14:anchorId="542CA759" wp14:editId="501CD793">
+            <wp:extent cx="5715000" cy="4023059"/>
+            <wp:effectExtent l="0" t="0" r="0" b="0"/>
+            <wp:docPr id="21" name="Picture 21"/>
+            <wp:cNvGraphicFramePr>
+              <a:graphicFrameLocks xmlns:a="http://schemas.openxmlformats.org/drawingml/2006/main" noChangeAspect="1"/>
+            </wp:cNvGraphicFramePr>
+            <a:graphic xmlns:a="http://schemas.openxmlformats.org/drawingml/2006/main">
+              <a:graphicData uri="http://schemas.openxmlformats.org/drawingml/2006/picture">
+                <pic:pic xmlns:pic="http://schemas.openxmlformats.org/drawingml/2006/picture">
+                  <pic:nvPicPr>
+                    <pic:cNvPr id="0" name="08_casos_uso_analisis_decision.png"/>
+                    <pic:cNvPicPr/>
+                  </pic:nvPicPr>
+                  <pic:blipFill>
+                    <a:blip r:embed="rId31"/>
+                    <a:stretch>
+                      <a:fillRect/>
+                    </a:stretch>
+                  </pic:blipFill>
+                  <pic:spPr>
+                    <a:xfrm>
+                      <a:off x="0" y="0"/>
+                      <a:ext cx="5715000" cy="4023059"/>
+                    </a:xfrm>
+                    <a:prstGeom prst="rect">
+                      <a:avLst/>
+                    </a:prstGeom>
+                  </pic:spPr>
+                </pic:pic>
+              </a:graphicData>
+            </a:graphic>
+          </wp:inline>
+        </w:drawing>
+      </w:r>
+    </w:p>
+    <w:p>
+      <w:pPr>
+        <w:pStyle w:val="Descripcin"/>
+      </w:pPr>
+      <w:r>
+        <w:t>Figura 4-5. Diagrama de caso</w:t>
+      </w:r>
+      <w:r>
+        <w:t>s de uso de análisis y decisión scout.</w:t>
+      </w:r>
+    </w:p>
+    <w:p>
       <w:pPr>
         <w:sectPr>
-          <w:footerReference w:type="even" r:id="rId27"/>
-          <w:footerReference w:type="default" r:id="rId28"/>
-          <w:footerReference w:type="first" r:id="rId29"/>
+          <w:footerReference w:type="even" r:id="rId32"/>
+          <w:footerReference w:type="default" r:id="rId33"/>
+          <w:footerReference w:type="first" r:id="rId34"/>
           <w:pgSz w:w="12240" w:h="15840"/>
           <w:pgMar w:top="1417" w:right="1701" w:bottom="1417" w:left="1701" w:header="708" w:footer="708" w:gutter="0"/>
           <w:cols w:space="708"/>
@@ -18332,7 +18864,7 @@
       </w:pPr>
       <w:bookmarkStart w:id="139" w:name="_Toc230120399"/>
       <w:bookmarkStart w:id="140" w:name="_Toc230197702"/>
-      <w:bookmarkStart w:id="141" w:name="_Toc230369179"/>
+      <w:bookmarkStart w:id="141" w:name="_Toc230376331"/>
       <w:r>
         <w:rPr>
           <w:rFonts w:ascii="Arial" w:hAnsi="Arial" w:cs="Arial"/>
@@ -18355,7 +18887,7 @@
       </w:pPr>
       <w:bookmarkStart w:id="142" w:name="_Toc230120400"/>
       <w:bookmarkStart w:id="143" w:name="_Toc230197703"/>
-      <w:bookmarkStart w:id="144" w:name="_Toc230369180"/>
+      <w:bookmarkStart w:id="144" w:name="_Toc230376332"/>
       <w:r>
         <w:rPr>
           <w:sz w:val="28"/>
@@ -18407,6 +18939,62 @@
       </w:r>
     </w:p>
     <w:p>
+      <w:r>
+        <w:t>La Figura 5-1 detalla el flujo de inferencia cuando un usuario consulta la proyeccion de potencial de un jugador.</w:t>
+      </w:r>
+    </w:p>
+    <w:p>
+      <w:r>
+        <w:rPr>
+          <w:noProof/>
+        </w:rPr>
+        <w:lastRenderedPageBreak/>
+        <w:drawing>
+          <wp:inline distT="0" distB="0" distL="0" distR="0" wp14:anchorId="7D86FEDC" wp14:editId="3EEC43AB">
+            <wp:extent cx="5806440" cy="2469904"/>
+            <wp:effectExtent l="0" t="0" r="0" b="0"/>
+            <wp:docPr id="11" name="Picture 11"/>
+            <wp:cNvGraphicFramePr>
+              <a:graphicFrameLocks xmlns:a="http://schemas.openxmlformats.org/drawingml/2006/main" noChangeAspect="1"/>
+            </wp:cNvGraphicFramePr>
+            <a:graphic xmlns:a="http://schemas.openxmlformats.org/drawingml/2006/main">
+              <a:graphicData uri="http://schemas.openxmlformats.org/drawingml/2006/picture">
+                <pic:pic xmlns:pic="http://schemas.openxmlformats.org/drawingml/2006/picture">
+                  <pic:nvPicPr>
+                    <pic:cNvPr id="0" name="01_secuencia_prediccion.png"/>
+                    <pic:cNvPicPr/>
+                  </pic:nvPicPr>
+                  <pic:blipFill>
+                    <a:blip r:embed="rId35"/>
+                    <a:stretch>
+                      <a:fillRect/>
+                    </a:stretch>
+                  </pic:blipFill>
+                  <pic:spPr>
+                    <a:xfrm>
+                      <a:off x="0" y="0"/>
+                      <a:ext cx="5806440" cy="2469904"/>
+                    </a:xfrm>
+                    <a:prstGeom prst="rect">
+                      <a:avLst/>
+                    </a:prstGeom>
+                  </pic:spPr>
+                </pic:pic>
+              </a:graphicData>
+            </a:graphic>
+          </wp:inline>
+        </w:drawing>
+      </w:r>
+    </w:p>
+    <w:p>
+      <w:pPr>
+        <w:pStyle w:val="Descripcin"/>
+      </w:pPr>
+      <w:r>
+        <w:t>Figura 5-1. Secuencia de prediccion de potencial de jugador.</w:t>
+      </w:r>
+    </w:p>
+    <w:p>
       <w:pPr>
         <w:pStyle w:val="Ttulo2"/>
         <w:rPr>
@@ -18415,7 +19003,7 @@
       </w:pPr>
       <w:bookmarkStart w:id="145" w:name="_Toc230120401"/>
       <w:bookmarkStart w:id="146" w:name="_Toc230197704"/>
-      <w:bookmarkStart w:id="147" w:name="_Toc230369181"/>
+      <w:bookmarkStart w:id="147" w:name="_Toc230376333"/>
       <w:r>
         <w:rPr>
           <w:sz w:val="28"/>
@@ -18438,15 +19026,63 @@
           <w:sz w:val="28"/>
           <w:szCs w:val="28"/>
         </w:rPr>
-        <w:t xml:space="preserve">El frontend utiliza Jinja2, Bootstrap, CSS propio y Chart.js. La UX fue ajustada para panel general, fichas de jugador, comparadores, formularios y modales CRUD. La carga de registros históricos se separó visualmente de la lectura de datos mediante </w:t>
-      </w:r>
-      <w:r>
-        <w:rPr>
-          <w:sz w:val="28"/>
-          <w:szCs w:val="28"/>
+        <w:t>El frontend utiliza Jinja2, Bootstrap, CSS propio y Chart.js. La UX fue ajustada para panel general, fichas de jugador, comparadores, formularios y modales CRUD. La carga de registros históricos se separó visualmente de la lectura de datos mediante modales/offcanvas, evitando formularios extensos incrustados en la pantalla principal.</w:t>
+      </w:r>
+    </w:p>
+    <w:p>
+      <w:r>
+        <w:t>La Figura 5-2 describe la carga del panel general, incluyendo validacion de sesion, cache in-memory, consultas SQLAlchemy y renderizado de la vista.</w:t>
+      </w:r>
+    </w:p>
+    <w:p>
+      <w:r>
+        <w:rPr>
+          <w:noProof/>
         </w:rPr>
         <w:lastRenderedPageBreak/>
-        <w:t>modales/offcanvas, evitando formularios extensos incrustados en la pantalla principal.</w:t>
+        <w:drawing>
+          <wp:inline distT="0" distB="0" distL="0" distR="0" wp14:anchorId="08ECD9CE" wp14:editId="016C6FC8">
+            <wp:extent cx="5806440" cy="3763614"/>
+            <wp:effectExtent l="0" t="0" r="0" b="0"/>
+            <wp:docPr id="12" name="Picture 12"/>
+            <wp:cNvGraphicFramePr>
+              <a:graphicFrameLocks xmlns:a="http://schemas.openxmlformats.org/drawingml/2006/main" noChangeAspect="1"/>
+            </wp:cNvGraphicFramePr>
+            <a:graphic xmlns:a="http://schemas.openxmlformats.org/drawingml/2006/main">
+              <a:graphicData uri="http://schemas.openxmlformats.org/drawingml/2006/picture">
+                <pic:pic xmlns:pic="http://schemas.openxmlformats.org/drawingml/2006/picture">
+                  <pic:nvPicPr>
+                    <pic:cNvPr id="0" name="02_secuencia_dashboard.png"/>
+                    <pic:cNvPicPr/>
+                  </pic:nvPicPr>
+                  <pic:blipFill>
+                    <a:blip r:embed="rId36"/>
+                    <a:stretch>
+                      <a:fillRect/>
+                    </a:stretch>
+                  </pic:blipFill>
+                  <pic:spPr>
+                    <a:xfrm>
+                      <a:off x="0" y="0"/>
+                      <a:ext cx="5806440" cy="3763614"/>
+                    </a:xfrm>
+                    <a:prstGeom prst="rect">
+                      <a:avLst/>
+                    </a:prstGeom>
+                  </pic:spPr>
+                </pic:pic>
+              </a:graphicData>
+            </a:graphic>
+          </wp:inline>
+        </w:drawing>
+      </w:r>
+    </w:p>
+    <w:p>
+      <w:pPr>
+        <w:pStyle w:val="Descripcin"/>
+      </w:pPr>
+      <w:r>
+        <w:t>Figura 5-2. Secuencia de carga del panel general.</w:t>
       </w:r>
     </w:p>
     <w:p>
@@ -18458,7 +19094,7 @@
       </w:pPr>
       <w:bookmarkStart w:id="148" w:name="_Toc230120402"/>
       <w:bookmarkStart w:id="149" w:name="_Toc230197705"/>
-      <w:bookmarkStart w:id="150" w:name="_Toc230369182"/>
+      <w:bookmarkStart w:id="150" w:name="_Toc230376334"/>
       <w:r>
         <w:rPr>
           <w:sz w:val="28"/>
@@ -18493,7 +19129,7 @@
       </w:pPr>
       <w:bookmarkStart w:id="151" w:name="_Toc230120403"/>
       <w:bookmarkStart w:id="152" w:name="_Toc230197706"/>
-      <w:bookmarkStart w:id="153" w:name="_Toc230369183"/>
+      <w:bookmarkStart w:id="153" w:name="_Toc230376335"/>
       <w:r>
         <w:rPr>
           <w:sz w:val="28"/>
@@ -18584,6 +19220,7 @@
                 <w:sz w:val="28"/>
                 <w:szCs w:val="28"/>
               </w:rPr>
+              <w:lastRenderedPageBreak/>
               <w:t>Clase</w:t>
             </w:r>
           </w:p>
@@ -18956,7 +19593,6 @@
     </w:p>
     <w:p>
       <w:r>
-        <w:lastRenderedPageBreak/>
         <w:t>La selección del modelo no se presenta como superioridad automática de deep learning. En la corrida documentada, LogisticRegression(class_weight="balanced") obtiene métricas levemente superiores en ROC-AUC, PR-AUC y F1. Por eso se conserva como baseline metodológico obligatorio y se documenta que PlayerNet queda integrado como modelo operativo del MVP.</w:t>
       </w:r>
     </w:p>
@@ -18974,7 +19610,7 @@
       </w:pPr>
       <w:bookmarkStart w:id="154" w:name="_Toc230120404"/>
       <w:bookmarkStart w:id="155" w:name="_Toc230197707"/>
-      <w:bookmarkStart w:id="156" w:name="_Toc230369184"/>
+      <w:bookmarkStart w:id="156" w:name="_Toc230376336"/>
       <w:r>
         <w:rPr>
           <w:sz w:val="28"/>
@@ -19072,6 +19708,7 @@
           <w:sz w:val="28"/>
           <w:szCs w:val="28"/>
         </w:rPr>
+        <w:lastRenderedPageBreak/>
         <w:t>• Bloqueo de SQLite en producción salvo opt-in explícito.</w:t>
       </w:r>
     </w:p>
@@ -19099,7 +19736,7 @@
       </w:pPr>
       <w:bookmarkStart w:id="157" w:name="_Toc230120405"/>
       <w:bookmarkStart w:id="158" w:name="_Toc230197708"/>
-      <w:bookmarkStart w:id="159" w:name="_Toc230369185"/>
+      <w:bookmarkStart w:id="159" w:name="_Toc230376337"/>
       <w:r>
         <w:rPr>
           <w:sz w:val="28"/>
@@ -19194,7 +19831,6 @@
                 <w:sz w:val="28"/>
                 <w:szCs w:val="28"/>
               </w:rPr>
-              <w:lastRenderedPageBreak/>
               <w:t>URL pública</w:t>
             </w:r>
           </w:p>
@@ -19403,11 +20039,67 @@
       </w:r>
     </w:p>
     <w:p>
+      <w:r>
+        <w:t>La Figura 5-3 representa el despliegue verificado del MVP en Render con Gunicorn, Flask, PostgreSQL y artefactos de Machine Learning.</w:t>
+      </w:r>
+    </w:p>
+    <w:p>
+      <w:r>
+        <w:rPr>
+          <w:noProof/>
+        </w:rPr>
+        <w:lastRenderedPageBreak/>
+        <w:drawing>
+          <wp:inline distT="0" distB="0" distL="0" distR="0" wp14:anchorId="38090B1F" wp14:editId="4DFC7855">
+            <wp:extent cx="5806440" cy="3441202"/>
+            <wp:effectExtent l="0" t="0" r="0" b="0"/>
+            <wp:docPr id="13" name="Picture 13"/>
+            <wp:cNvGraphicFramePr>
+              <a:graphicFrameLocks xmlns:a="http://schemas.openxmlformats.org/drawingml/2006/main" noChangeAspect="1"/>
+            </wp:cNvGraphicFramePr>
+            <a:graphic xmlns:a="http://schemas.openxmlformats.org/drawingml/2006/main">
+              <a:graphicData uri="http://schemas.openxmlformats.org/drawingml/2006/picture">
+                <pic:pic xmlns:pic="http://schemas.openxmlformats.org/drawingml/2006/picture">
+                  <pic:nvPicPr>
+                    <pic:cNvPr id="0" name="04_despliegue.png"/>
+                    <pic:cNvPicPr/>
+                  </pic:nvPicPr>
+                  <pic:blipFill>
+                    <a:blip r:embed="rId37"/>
+                    <a:stretch>
+                      <a:fillRect/>
+                    </a:stretch>
+                  </pic:blipFill>
+                  <pic:spPr>
+                    <a:xfrm>
+                      <a:off x="0" y="0"/>
+                      <a:ext cx="5806440" cy="3441202"/>
+                    </a:xfrm>
+                    <a:prstGeom prst="rect">
+                      <a:avLst/>
+                    </a:prstGeom>
+                  </pic:spPr>
+                </pic:pic>
+              </a:graphicData>
+            </a:graphic>
+          </wp:inline>
+        </w:drawing>
+      </w:r>
+    </w:p>
+    <w:p>
+      <w:pPr>
+        <w:pStyle w:val="Descripcin"/>
+      </w:pPr>
+      <w:r>
+        <w:t>Figura 5-3. Diagrama de despliegue en Render.</w:t>
+      </w:r>
+    </w:p>
+    <w:p>
       <w:pPr>
         <w:sectPr>
-          <w:footerReference w:type="even" r:id="rId30"/>
-          <w:footerReference w:type="default" r:id="rId31"/>
-          <w:footerReference w:type="first" r:id="rId32"/>
+          <w:footerReference w:type="even" r:id="rId38"/>
+          <w:footerReference w:type="default" r:id="rId39"/>
+          <w:footerReference w:type="first" r:id="rId40"/>
           <w:pgSz w:w="12240" w:h="15840"/>
           <w:pgMar w:top="1417" w:right="1701" w:bottom="1417" w:left="1701" w:header="708" w:footer="708" w:gutter="0"/>
           <w:cols w:space="708"/>
@@ -19427,7 +20119,7 @@
       </w:pPr>
       <w:bookmarkStart w:id="160" w:name="_Toc230120406"/>
       <w:bookmarkStart w:id="161" w:name="_Toc230197709"/>
-      <w:bookmarkStart w:id="162" w:name="_Toc230369186"/>
+      <w:bookmarkStart w:id="162" w:name="_Toc230376338"/>
       <w:r>
         <w:rPr>
           <w:rFonts w:ascii="Arial" w:hAnsi="Arial" w:cs="Arial"/>
@@ -19450,7 +20142,7 @@
       </w:pPr>
       <w:bookmarkStart w:id="163" w:name="_Toc230120407"/>
       <w:bookmarkStart w:id="164" w:name="_Toc230197710"/>
-      <w:bookmarkStart w:id="165" w:name="_Toc230369187"/>
+      <w:bookmarkStart w:id="165" w:name="_Toc230376339"/>
       <w:r>
         <w:rPr>
           <w:sz w:val="28"/>
@@ -19886,7 +20578,7 @@
       </w:pPr>
       <w:bookmarkStart w:id="166" w:name="_Toc230120408"/>
       <w:bookmarkStart w:id="167" w:name="_Toc230197711"/>
-      <w:bookmarkStart w:id="168" w:name="_Toc230369188"/>
+      <w:bookmarkStart w:id="168" w:name="_Toc230376340"/>
       <w:r>
         <w:rPr>
           <w:sz w:val="28"/>
@@ -20151,7 +20843,7 @@
       </w:pPr>
       <w:bookmarkStart w:id="169" w:name="_Toc230120409"/>
       <w:bookmarkStart w:id="170" w:name="_Toc230197712"/>
-      <w:bookmarkStart w:id="171" w:name="_Toc230369189"/>
+      <w:bookmarkStart w:id="171" w:name="_Toc230376341"/>
       <w:r>
         <w:rPr>
           <w:sz w:val="28"/>
@@ -20544,7 +21236,7 @@
       </w:pPr>
       <w:bookmarkStart w:id="172" w:name="_Toc230120410"/>
       <w:bookmarkStart w:id="173" w:name="_Toc230197713"/>
-      <w:bookmarkStart w:id="174" w:name="_Toc230369190"/>
+      <w:bookmarkStart w:id="174" w:name="_Toc230376342"/>
       <w:r>
         <w:rPr>
           <w:sz w:val="28"/>
@@ -21008,7 +21700,7 @@
           <w:noProof/>
         </w:rPr>
         <w:drawing>
-          <wp:inline distT="0" distB="0" distL="0" distR="0" wp14:anchorId="69FA724A" wp14:editId="47FF6284">
+          <wp:inline distT="0" distB="0" distL="0" distR="0" wp14:anchorId="69A13289" wp14:editId="681CB3EB">
             <wp:extent cx="5486400" cy="3200400"/>
             <wp:effectExtent l="0" t="0" r="0" b="0"/>
             <wp:docPr id="8" name="Picture 8"/>
@@ -21023,7 +21715,7 @@
                     <pic:cNvPicPr/>
                   </pic:nvPicPr>
                   <pic:blipFill>
-                    <a:blip r:embed="rId33"/>
+                    <a:blip r:embed="rId41"/>
                     <a:stretch>
                       <a:fillRect/>
                     </a:stretch>
@@ -21067,7 +21759,7 @@
       </w:pPr>
       <w:bookmarkStart w:id="175" w:name="_Toc230120411"/>
       <w:bookmarkStart w:id="176" w:name="_Toc230197714"/>
-      <w:bookmarkStart w:id="177" w:name="_Toc230369191"/>
+      <w:bookmarkStart w:id="177" w:name="_Toc230376343"/>
       <w:r>
         <w:rPr>
           <w:sz w:val="28"/>
@@ -21657,7 +22349,7 @@
         </w:rPr>
         <w:lastRenderedPageBreak/>
         <w:drawing>
-          <wp:inline distT="0" distB="0" distL="0" distR="0" wp14:anchorId="2B732F6E" wp14:editId="7CEF61C1">
+          <wp:inline distT="0" distB="0" distL="0" distR="0" wp14:anchorId="302F2BC5" wp14:editId="1CAEDF8A">
             <wp:extent cx="5486400" cy="3810000"/>
             <wp:effectExtent l="0" t="0" r="0" b="0"/>
             <wp:docPr id="2" name="Picture 2"/>
@@ -21672,7 +22364,7 @@
                     <pic:cNvPicPr/>
                   </pic:nvPicPr>
                   <pic:blipFill>
-                    <a:blip r:embed="rId34"/>
+                    <a:blip r:embed="rId42"/>
                     <a:stretch>
                       <a:fillRect/>
                     </a:stretch>
@@ -21720,7 +22412,7 @@
         </w:rPr>
         <w:lastRenderedPageBreak/>
         <w:drawing>
-          <wp:inline distT="0" distB="0" distL="0" distR="0" wp14:anchorId="06861E4E" wp14:editId="62454D1B">
+          <wp:inline distT="0" distB="0" distL="0" distR="0" wp14:anchorId="7BC262BB" wp14:editId="6B52A993">
             <wp:extent cx="5486400" cy="8035290"/>
             <wp:effectExtent l="0" t="0" r="0" b="0"/>
             <wp:docPr id="3" name="Picture 3"/>
@@ -21735,7 +22427,7 @@
                     <pic:cNvPicPr/>
                   </pic:nvPicPr>
                   <pic:blipFill>
-                    <a:blip r:embed="rId35"/>
+                    <a:blip r:embed="rId43"/>
                     <a:stretch>
                       <a:fillRect/>
                     </a:stretch>
@@ -21784,7 +22476,7 @@
         </w:rPr>
         <w:lastRenderedPageBreak/>
         <w:drawing>
-          <wp:inline distT="0" distB="0" distL="0" distR="0" wp14:anchorId="17ABFC8C" wp14:editId="3C044460">
+          <wp:inline distT="0" distB="0" distL="0" distR="0" wp14:anchorId="5D40602A" wp14:editId="09B61D87">
             <wp:extent cx="5486400" cy="8721090"/>
             <wp:effectExtent l="0" t="0" r="0" b="0"/>
             <wp:docPr id="4" name="Picture 4"/>
@@ -21799,7 +22491,7 @@
                     <pic:cNvPicPr/>
                   </pic:nvPicPr>
                   <pic:blipFill>
-                    <a:blip r:embed="rId36"/>
+                    <a:blip r:embed="rId44"/>
                     <a:stretch>
                       <a:fillRect/>
                     </a:stretch>
@@ -21848,7 +22540,7 @@
         </w:rPr>
         <w:lastRenderedPageBreak/>
         <w:drawing>
-          <wp:inline distT="0" distB="0" distL="0" distR="0" wp14:anchorId="0ABFF597" wp14:editId="013D45C0">
+          <wp:inline distT="0" distB="0" distL="0" distR="0" wp14:anchorId="2A977798" wp14:editId="0FD3DADD">
             <wp:extent cx="5486400" cy="16489680"/>
             <wp:effectExtent l="0" t="0" r="0" b="0"/>
             <wp:docPr id="5" name="Picture 5"/>
@@ -21863,7 +22555,7 @@
                     <pic:cNvPicPr/>
                   </pic:nvPicPr>
                   <pic:blipFill>
-                    <a:blip r:embed="rId37"/>
+                    <a:blip r:embed="rId45"/>
                     <a:stretch>
                       <a:fillRect/>
                     </a:stretch>
@@ -21912,7 +22604,7 @@
         </w:rPr>
         <w:lastRenderedPageBreak/>
         <w:drawing>
-          <wp:inline distT="0" distB="0" distL="0" distR="0" wp14:anchorId="26A98A74" wp14:editId="5131445B">
+          <wp:inline distT="0" distB="0" distL="0" distR="0" wp14:anchorId="4D7FFF31" wp14:editId="426DC967">
             <wp:extent cx="5486400" cy="9208770"/>
             <wp:effectExtent l="0" t="0" r="0" b="0"/>
             <wp:docPr id="6" name="Picture 6"/>
@@ -21927,7 +22619,7 @@
                     <pic:cNvPicPr/>
                   </pic:nvPicPr>
                   <pic:blipFill>
-                    <a:blip r:embed="rId38"/>
+                    <a:blip r:embed="rId46"/>
                     <a:stretch>
                       <a:fillRect/>
                     </a:stretch>
@@ -21976,7 +22668,7 @@
         </w:rPr>
         <w:lastRenderedPageBreak/>
         <w:drawing>
-          <wp:inline distT="0" distB="0" distL="0" distR="0" wp14:anchorId="6A182F96" wp14:editId="3CE66B74">
+          <wp:inline distT="0" distB="0" distL="0" distR="0" wp14:anchorId="08D43CA7" wp14:editId="51278A0A">
             <wp:extent cx="5486400" cy="8176260"/>
             <wp:effectExtent l="0" t="0" r="0" b="0"/>
             <wp:docPr id="7" name="Picture 7"/>
@@ -21991,7 +22683,7 @@
                     <pic:cNvPicPr/>
                   </pic:nvPicPr>
                   <pic:blipFill>
-                    <a:blip r:embed="rId39"/>
+                    <a:blip r:embed="rId47"/>
                     <a:stretch>
                       <a:fillRect/>
                     </a:stretch>
@@ -22034,7 +22726,7 @@
       </w:pPr>
       <w:bookmarkStart w:id="178" w:name="_Toc230120412"/>
       <w:bookmarkStart w:id="179" w:name="_Toc230197715"/>
-      <w:bookmarkStart w:id="180" w:name="_Toc230369192"/>
+      <w:bookmarkStart w:id="180" w:name="_Toc230376344"/>
       <w:r>
         <w:rPr>
           <w:sz w:val="28"/>
@@ -22108,9 +22800,9 @@
     <w:p>
       <w:pPr>
         <w:sectPr>
-          <w:footerReference w:type="even" r:id="rId40"/>
-          <w:footerReference w:type="default" r:id="rId41"/>
-          <w:footerReference w:type="first" r:id="rId42"/>
+          <w:footerReference w:type="even" r:id="rId48"/>
+          <w:footerReference w:type="default" r:id="rId49"/>
+          <w:footerReference w:type="first" r:id="rId50"/>
           <w:pgSz w:w="12240" w:h="15840"/>
           <w:pgMar w:top="1417" w:right="1701" w:bottom="1417" w:left="1701" w:header="708" w:footer="708" w:gutter="0"/>
           <w:cols w:space="708"/>
@@ -22129,7 +22821,7 @@
       </w:pPr>
       <w:bookmarkStart w:id="181" w:name="_Toc230120413"/>
       <w:bookmarkStart w:id="182" w:name="_Toc230197716"/>
-      <w:bookmarkStart w:id="183" w:name="_Toc230369193"/>
+      <w:bookmarkStart w:id="183" w:name="_Toc230376345"/>
       <w:r>
         <w:rPr>
           <w:rFonts w:ascii="Arial" w:hAnsi="Arial" w:cs="Arial"/>
@@ -22152,7 +22844,7 @@
       </w:pPr>
       <w:bookmarkStart w:id="184" w:name="_Toc230120414"/>
       <w:bookmarkStart w:id="185" w:name="_Toc230197717"/>
-      <w:bookmarkStart w:id="186" w:name="_Toc230369194"/>
+      <w:bookmarkStart w:id="186" w:name="_Toc230376346"/>
       <w:r>
         <w:rPr>
           <w:sz w:val="28"/>
@@ -22202,7 +22894,7 @@
       </w:pPr>
       <w:bookmarkStart w:id="187" w:name="_Toc230120415"/>
       <w:bookmarkStart w:id="188" w:name="_Toc230197718"/>
-      <w:bookmarkStart w:id="189" w:name="_Toc230369195"/>
+      <w:bookmarkStart w:id="189" w:name="_Toc230376347"/>
       <w:r>
         <w:rPr>
           <w:sz w:val="28"/>
@@ -22677,7 +23369,7 @@
       </w:pPr>
       <w:bookmarkStart w:id="190" w:name="_Toc230120416"/>
       <w:bookmarkStart w:id="191" w:name="_Toc230197719"/>
-      <w:bookmarkStart w:id="192" w:name="_Toc230369196"/>
+      <w:bookmarkStart w:id="192" w:name="_Toc230376348"/>
       <w:r>
         <w:rPr>
           <w:sz w:val="28"/>
@@ -22772,7 +23464,7 @@
       </w:pPr>
       <w:bookmarkStart w:id="193" w:name="_Toc230120417"/>
       <w:bookmarkStart w:id="194" w:name="_Toc230197720"/>
-      <w:bookmarkStart w:id="195" w:name="_Toc230369197"/>
+      <w:bookmarkStart w:id="195" w:name="_Toc230376349"/>
       <w:r>
         <w:rPr>
           <w:sz w:val="28"/>
@@ -22862,9 +23554,9 @@
     <w:p>
       <w:pPr>
         <w:sectPr>
-          <w:footerReference w:type="even" r:id="rId43"/>
-          <w:footerReference w:type="default" r:id="rId44"/>
-          <w:footerReference w:type="first" r:id="rId45"/>
+          <w:footerReference w:type="even" r:id="rId51"/>
+          <w:footerReference w:type="default" r:id="rId52"/>
+          <w:footerReference w:type="first" r:id="rId53"/>
           <w:pgSz w:w="12240" w:h="15840"/>
           <w:pgMar w:top="1417" w:right="1701" w:bottom="1417" w:left="1701" w:header="708" w:footer="708" w:gutter="0"/>
           <w:cols w:space="708"/>
@@ -22883,7 +23575,7 @@
       </w:pPr>
       <w:bookmarkStart w:id="196" w:name="_Toc230120418"/>
       <w:bookmarkStart w:id="197" w:name="_Toc230197721"/>
-      <w:bookmarkStart w:id="198" w:name="_Toc230369198"/>
+      <w:bookmarkStart w:id="198" w:name="_Toc230376350"/>
       <w:r>
         <w:rPr>
           <w:rFonts w:ascii="Arial" w:hAnsi="Arial" w:cs="Arial"/>
@@ -23040,9 +23732,9 @@
     <w:p>
       <w:pPr>
         <w:sectPr>
-          <w:footerReference w:type="even" r:id="rId46"/>
-          <w:footerReference w:type="default" r:id="rId47"/>
-          <w:footerReference w:type="first" r:id="rId48"/>
+          <w:footerReference w:type="even" r:id="rId54"/>
+          <w:footerReference w:type="default" r:id="rId55"/>
+          <w:footerReference w:type="first" r:id="rId56"/>
           <w:pgSz w:w="12240" w:h="15840"/>
           <w:pgMar w:top="1417" w:right="1701" w:bottom="1417" w:left="1701" w:header="708" w:footer="708" w:gutter="0"/>
           <w:cols w:space="708"/>
@@ -23061,7 +23753,7 @@
       </w:pPr>
       <w:bookmarkStart w:id="199" w:name="_Toc230120419"/>
       <w:bookmarkStart w:id="200" w:name="_Toc230197722"/>
-      <w:bookmarkStart w:id="201" w:name="_Toc230369199"/>
+      <w:bookmarkStart w:id="201" w:name="_Toc230376351"/>
       <w:r>
         <w:rPr>
           <w:szCs w:val="28"/>
@@ -23097,7 +23789,7 @@
       </w:pPr>
       <w:bookmarkStart w:id="202" w:name="_Toc230120420"/>
       <w:bookmarkStart w:id="203" w:name="_Toc230197723"/>
-      <w:bookmarkStart w:id="204" w:name="_Toc230369200"/>
+      <w:bookmarkStart w:id="204" w:name="_Toc230376352"/>
       <w:r>
         <w:rPr>
           <w:sz w:val="28"/>
@@ -23472,7 +24164,7 @@
       </w:pPr>
       <w:bookmarkStart w:id="205" w:name="_Toc230120421"/>
       <w:bookmarkStart w:id="206" w:name="_Toc230197724"/>
-      <w:bookmarkStart w:id="207" w:name="_Toc230369201"/>
+      <w:bookmarkStart w:id="207" w:name="_Toc230376353"/>
       <w:r>
         <w:rPr>
           <w:sz w:val="28"/>
@@ -23890,7 +24582,7 @@
       </w:pPr>
       <w:bookmarkStart w:id="208" w:name="_Toc230120422"/>
       <w:bookmarkStart w:id="209" w:name="_Toc230197725"/>
-      <w:bookmarkStart w:id="210" w:name="_Toc230369202"/>
+      <w:bookmarkStart w:id="210" w:name="_Toc230376354"/>
       <w:r>
         <w:rPr>
           <w:sz w:val="28"/>
@@ -24653,9 +25345,9 @@
     <w:p>
       <w:pPr>
         <w:sectPr>
-          <w:footerReference w:type="even" r:id="rId49"/>
-          <w:footerReference w:type="default" r:id="rId50"/>
-          <w:footerReference w:type="first" r:id="rId51"/>
+          <w:footerReference w:type="even" r:id="rId57"/>
+          <w:footerReference w:type="default" r:id="rId58"/>
+          <w:footerReference w:type="first" r:id="rId59"/>
           <w:pgSz w:w="12240" w:h="15840"/>
           <w:pgMar w:top="1417" w:right="1701" w:bottom="1417" w:left="1701" w:header="708" w:footer="708" w:gutter="0"/>
           <w:cols w:space="708"/>
@@ -24672,7 +25364,7 @@
       </w:pPr>
       <w:bookmarkStart w:id="211" w:name="_Toc230120423"/>
       <w:bookmarkStart w:id="212" w:name="_Toc230197726"/>
-      <w:bookmarkStart w:id="213" w:name="_Toc230369203"/>
+      <w:bookmarkStart w:id="213" w:name="_Toc230376355"/>
       <w:r>
         <w:rPr>
           <w:szCs w:val="28"/>
@@ -24708,7 +25400,7 @@
       </w:pPr>
       <w:bookmarkStart w:id="214" w:name="_Toc230120424"/>
       <w:bookmarkStart w:id="215" w:name="_Toc230197727"/>
-      <w:bookmarkStart w:id="216" w:name="_Toc230369204"/>
+      <w:bookmarkStart w:id="216" w:name="_Toc230376356"/>
       <w:r>
         <w:rPr>
           <w:sz w:val="28"/>
@@ -24788,7 +25480,7 @@
       </w:pPr>
       <w:bookmarkStart w:id="217" w:name="_Toc230120425"/>
       <w:bookmarkStart w:id="218" w:name="_Toc230197728"/>
-      <w:bookmarkStart w:id="219" w:name="_Toc230369205"/>
+      <w:bookmarkStart w:id="219" w:name="_Toc230376357"/>
       <w:r>
         <w:rPr>
           <w:sz w:val="28"/>
@@ -24883,7 +25575,7 @@
       </w:pPr>
       <w:bookmarkStart w:id="220" w:name="_Toc230120426"/>
       <w:bookmarkStart w:id="221" w:name="_Toc230197729"/>
-      <w:bookmarkStart w:id="222" w:name="_Toc230369206"/>
+      <w:bookmarkStart w:id="222" w:name="_Toc230376358"/>
       <w:r>
         <w:rPr>
           <w:sz w:val="28"/>
@@ -24970,11 +25662,565 @@
         <w:t>• La decisión de modelo debe revisarse con datos reales; el baseline logístico fue competitivo en la corrida actual.</w:t>
       </w:r>
     </w:p>
+    <w:p>
+      <w:r>
+        <w:br w:type="page"/>
+      </w:r>
+    </w:p>
+    <w:p>
+      <w:pPr>
+        <w:pStyle w:val="Ttulo2"/>
+      </w:pPr>
+      <w:bookmarkStart w:id="223" w:name="_Toc230376359"/>
+      <w:r>
+        <w:lastRenderedPageBreak/>
+        <w:t>10.4 Diagramas ampliados</w:t>
+      </w:r>
+      <w:bookmarkEnd w:id="223"/>
+    </w:p>
+    <w:p>
+      <w:r>
+        <w:t>Esta sección incorpora los diagramas técnicos en páginas independientes para facilitar su lectura. Las mismas figuras se mantienen previamente en los capítulos correspondientes como referencia contextual.</w:t>
+      </w:r>
+    </w:p>
+    <w:p>
+      <w:r>
+        <w:t>La Figura 10-1 presenta en tamaño ampliado los componentes del cliente, la aplicación Flask, servicios, persistencia y módulo de Machine Learning.</w:t>
+      </w:r>
+    </w:p>
+    <w:p>
+      <w:pPr>
+        <w:jc w:val="center"/>
+      </w:pPr>
+      <w:r>
+        <w:rPr>
+          <w:noProof/>
+        </w:rPr>
+        <w:drawing>
+          <wp:inline distT="0" distB="0" distL="0" distR="0" wp14:anchorId="74E78463" wp14:editId="70CEB33D">
+            <wp:extent cx="6400800" cy="1650017"/>
+            <wp:effectExtent l="0" t="0" r="0" b="0"/>
+            <wp:docPr id="14" name="Picture 14"/>
+            <wp:cNvGraphicFramePr>
+              <a:graphicFrameLocks xmlns:a="http://schemas.openxmlformats.org/drawingml/2006/main" noChangeAspect="1"/>
+            </wp:cNvGraphicFramePr>
+            <a:graphic xmlns:a="http://schemas.openxmlformats.org/drawingml/2006/main">
+              <a:graphicData uri="http://schemas.openxmlformats.org/drawingml/2006/picture">
+                <pic:pic xmlns:pic="http://schemas.openxmlformats.org/drawingml/2006/picture">
+                  <pic:nvPicPr>
+                    <pic:cNvPr id="0" name="image.png"/>
+                    <pic:cNvPicPr/>
+                  </pic:nvPicPr>
+                  <pic:blipFill>
+                    <a:blip r:embed="rId27"/>
+                    <a:stretch>
+                      <a:fillRect/>
+                    </a:stretch>
+                  </pic:blipFill>
+                  <pic:spPr>
+                    <a:xfrm>
+                      <a:off x="0" y="0"/>
+                      <a:ext cx="6400800" cy="1650017"/>
+                    </a:xfrm>
+                    <a:prstGeom prst="rect">
+                      <a:avLst/>
+                    </a:prstGeom>
+                  </pic:spPr>
+                </pic:pic>
+              </a:graphicData>
+            </a:graphic>
+          </wp:inline>
+        </w:drawing>
+      </w:r>
+    </w:p>
+    <w:p>
+      <w:pPr>
+        <w:pStyle w:val="Descripcin"/>
+      </w:pPr>
+      <w:r>
+        <w:t>Figura 10-1. Diagrama de componentes de TPScouting ampliado.</w:t>
+      </w:r>
+    </w:p>
+    <w:p>
+      <w:r>
+        <w:br w:type="page"/>
+      </w:r>
+    </w:p>
+    <w:p>
+      <w:r>
+        <w:lastRenderedPageBreak/>
+        <w:t>La Figura 10-2 presenta en tamaño ampliado las clases principales definidas en el modelo SQLAlchemy y sus relaciones.</w:t>
+      </w:r>
+    </w:p>
+    <w:p>
+      <w:pPr>
+        <w:jc w:val="center"/>
+      </w:pPr>
+      <w:r>
+        <w:rPr>
+          <w:noProof/>
+        </w:rPr>
+        <w:drawing>
+          <wp:inline distT="0" distB="0" distL="0" distR="0" wp14:anchorId="44BF0CF1" wp14:editId="70605509">
+            <wp:extent cx="6400800" cy="3174820"/>
+            <wp:effectExtent l="0" t="0" r="0" b="0"/>
+            <wp:docPr id="15" name="Picture 15"/>
+            <wp:cNvGraphicFramePr>
+              <a:graphicFrameLocks xmlns:a="http://schemas.openxmlformats.org/drawingml/2006/main" noChangeAspect="1"/>
+            </wp:cNvGraphicFramePr>
+            <a:graphic xmlns:a="http://schemas.openxmlformats.org/drawingml/2006/main">
+              <a:graphicData uri="http://schemas.openxmlformats.org/drawingml/2006/picture">
+                <pic:pic xmlns:pic="http://schemas.openxmlformats.org/drawingml/2006/picture">
+                  <pic:nvPicPr>
+                    <pic:cNvPr id="0" name="image.png"/>
+                    <pic:cNvPicPr/>
+                  </pic:nvPicPr>
+                  <pic:blipFill>
+                    <a:blip r:embed="rId28"/>
+                    <a:stretch>
+                      <a:fillRect/>
+                    </a:stretch>
+                  </pic:blipFill>
+                  <pic:spPr>
+                    <a:xfrm>
+                      <a:off x="0" y="0"/>
+                      <a:ext cx="6400800" cy="3174820"/>
+                    </a:xfrm>
+                    <a:prstGeom prst="rect">
+                      <a:avLst/>
+                    </a:prstGeom>
+                  </pic:spPr>
+                </pic:pic>
+              </a:graphicData>
+            </a:graphic>
+          </wp:inline>
+        </w:drawing>
+      </w:r>
+    </w:p>
+    <w:p>
+      <w:pPr>
+        <w:pStyle w:val="Descripcin"/>
+      </w:pPr>
+      <w:r>
+        <w:t>Figura 10-2. Diagrama de clases del modelo de dominio ampliado.</w:t>
+      </w:r>
+    </w:p>
+    <w:p>
+      <w:r>
+        <w:br w:type="page"/>
+      </w:r>
+    </w:p>
+    <w:p>
+      <w:r>
+        <w:lastRenderedPageBreak/>
+        <w:t>La Figura 10-3 presenta en tamaño ampliado el flujo de consulta de potencial de un jugador.</w:t>
+      </w:r>
+    </w:p>
+    <w:p>
+      <w:pPr>
+        <w:jc w:val="center"/>
+      </w:pPr>
+      <w:r>
+        <w:rPr>
+          <w:noProof/>
+        </w:rPr>
+        <w:drawing>
+          <wp:inline distT="0" distB="0" distL="0" distR="0" wp14:anchorId="3AAB3228" wp14:editId="54AFF3FC">
+            <wp:extent cx="6400800" cy="2722728"/>
+            <wp:effectExtent l="0" t="0" r="0" b="0"/>
+            <wp:docPr id="16" name="Picture 16"/>
+            <wp:cNvGraphicFramePr>
+              <a:graphicFrameLocks xmlns:a="http://schemas.openxmlformats.org/drawingml/2006/main" noChangeAspect="1"/>
+            </wp:cNvGraphicFramePr>
+            <a:graphic xmlns:a="http://schemas.openxmlformats.org/drawingml/2006/main">
+              <a:graphicData uri="http://schemas.openxmlformats.org/drawingml/2006/picture">
+                <pic:pic xmlns:pic="http://schemas.openxmlformats.org/drawingml/2006/picture">
+                  <pic:nvPicPr>
+                    <pic:cNvPr id="0" name="image.png"/>
+                    <pic:cNvPicPr/>
+                  </pic:nvPicPr>
+                  <pic:blipFill>
+                    <a:blip r:embed="rId35"/>
+                    <a:stretch>
+                      <a:fillRect/>
+                    </a:stretch>
+                  </pic:blipFill>
+                  <pic:spPr>
+                    <a:xfrm>
+                      <a:off x="0" y="0"/>
+                      <a:ext cx="6400800" cy="2722728"/>
+                    </a:xfrm>
+                    <a:prstGeom prst="rect">
+                      <a:avLst/>
+                    </a:prstGeom>
+                  </pic:spPr>
+                </pic:pic>
+              </a:graphicData>
+            </a:graphic>
+          </wp:inline>
+        </w:drawing>
+      </w:r>
+    </w:p>
+    <w:p>
+      <w:pPr>
+        <w:pStyle w:val="Descripcin"/>
+      </w:pPr>
+      <w:r>
+        <w:t>Figura 10-3. Diagrama de secuencia de predicción ampliado.</w:t>
+      </w:r>
+    </w:p>
+    <w:p>
+      <w:r>
+        <w:br w:type="page"/>
+      </w:r>
+    </w:p>
+    <w:p>
+      <w:r>
+        <w:lastRenderedPageBreak/>
+        <w:t>La Figura 10-4 presenta en tamaño ampliado el flujo de carga del panel general, incluyendo cache y consultas a base de datos.</w:t>
+      </w:r>
+    </w:p>
+    <w:p>
+      <w:pPr>
+        <w:jc w:val="center"/>
+      </w:pPr>
+      <w:r>
+        <w:rPr>
+          <w:noProof/>
+        </w:rPr>
+        <w:drawing>
+          <wp:inline distT="0" distB="0" distL="0" distR="0" wp14:anchorId="7D2FE103" wp14:editId="30D82175">
+            <wp:extent cx="6400800" cy="4148866"/>
+            <wp:effectExtent l="0" t="0" r="0" b="0"/>
+            <wp:docPr id="17" name="Picture 17"/>
+            <wp:cNvGraphicFramePr>
+              <a:graphicFrameLocks xmlns:a="http://schemas.openxmlformats.org/drawingml/2006/main" noChangeAspect="1"/>
+            </wp:cNvGraphicFramePr>
+            <a:graphic xmlns:a="http://schemas.openxmlformats.org/drawingml/2006/main">
+              <a:graphicData uri="http://schemas.openxmlformats.org/drawingml/2006/picture">
+                <pic:pic xmlns:pic="http://schemas.openxmlformats.org/drawingml/2006/picture">
+                  <pic:nvPicPr>
+                    <pic:cNvPr id="0" name="image.png"/>
+                    <pic:cNvPicPr/>
+                  </pic:nvPicPr>
+                  <pic:blipFill>
+                    <a:blip r:embed="rId36"/>
+                    <a:stretch>
+                      <a:fillRect/>
+                    </a:stretch>
+                  </pic:blipFill>
+                  <pic:spPr>
+                    <a:xfrm>
+                      <a:off x="0" y="0"/>
+                      <a:ext cx="6400800" cy="4148866"/>
+                    </a:xfrm>
+                    <a:prstGeom prst="rect">
+                      <a:avLst/>
+                    </a:prstGeom>
+                  </pic:spPr>
+                </pic:pic>
+              </a:graphicData>
+            </a:graphic>
+          </wp:inline>
+        </w:drawing>
+      </w:r>
+    </w:p>
+    <w:p>
+      <w:pPr>
+        <w:pStyle w:val="Descripcin"/>
+      </w:pPr>
+      <w:r>
+        <w:t>Figura 10-4. Diagrama de secuencia del panel general ampliado.</w:t>
+      </w:r>
+    </w:p>
+    <w:p>
+      <w:r>
+        <w:br w:type="page"/>
+      </w:r>
+    </w:p>
+    <w:p>
+      <w:r>
+        <w:lastRenderedPageBreak/>
+        <w:t>La Figura 10-5 presenta en tamaño ampliado la relación entre navegador, Render, Gunicorn, Flask, PostgreSQL y artefactos ML.</w:t>
+      </w:r>
+    </w:p>
+    <w:p>
+      <w:pPr>
+        <w:jc w:val="center"/>
+      </w:pPr>
+      <w:r>
+        <w:rPr>
+          <w:noProof/>
+        </w:rPr>
+        <w:drawing>
+          <wp:inline distT="0" distB="0" distL="0" distR="0" wp14:anchorId="6E885899" wp14:editId="7FBBD047">
+            <wp:extent cx="6400800" cy="3793451"/>
+            <wp:effectExtent l="0" t="0" r="0" b="0"/>
+            <wp:docPr id="18" name="Picture 18"/>
+            <wp:cNvGraphicFramePr>
+              <a:graphicFrameLocks xmlns:a="http://schemas.openxmlformats.org/drawingml/2006/main" noChangeAspect="1"/>
+            </wp:cNvGraphicFramePr>
+            <a:graphic xmlns:a="http://schemas.openxmlformats.org/drawingml/2006/main">
+              <a:graphicData uri="http://schemas.openxmlformats.org/drawingml/2006/picture">
+                <pic:pic xmlns:pic="http://schemas.openxmlformats.org/drawingml/2006/picture">
+                  <pic:nvPicPr>
+                    <pic:cNvPr id="0" name="image.png"/>
+                    <pic:cNvPicPr/>
+                  </pic:nvPicPr>
+                  <pic:blipFill>
+                    <a:blip r:embed="rId37"/>
+                    <a:stretch>
+                      <a:fillRect/>
+                    </a:stretch>
+                  </pic:blipFill>
+                  <pic:spPr>
+                    <a:xfrm>
+                      <a:off x="0" y="0"/>
+                      <a:ext cx="6400800" cy="3793451"/>
+                    </a:xfrm>
+                    <a:prstGeom prst="rect">
+                      <a:avLst/>
+                    </a:prstGeom>
+                  </pic:spPr>
+                </pic:pic>
+              </a:graphicData>
+            </a:graphic>
+          </wp:inline>
+        </w:drawing>
+      </w:r>
+    </w:p>
+    <w:p>
+      <w:pPr>
+        <w:pStyle w:val="Descripcin"/>
+      </w:pPr>
+      <w:r>
+        <w:t>Figura 10-5. Diagrama de despliegue en Render ampliado.</w:t>
+      </w:r>
+    </w:p>
+    <w:p>
+      <w:r>
+        <w:br w:type="page"/>
+      </w:r>
+    </w:p>
+    <w:p>
+      <w:pPr>
+        <w:pStyle w:val="Ttulo2"/>
+      </w:pPr>
+      <w:bookmarkStart w:id="224" w:name="_Toc230376360"/>
+      <w:r>
+        <w:lastRenderedPageBreak/>
+        <w:t>10.5 Casos de uso ampliados</w:t>
+      </w:r>
+      <w:bookmarkEnd w:id="224"/>
+    </w:p>
+    <w:p>
+      <w:r>
+        <w:t xml:space="preserve">Esta sección incorpora los diagramas de casos de uso en páginas </w:t>
+      </w:r>
+      <w:r>
+        <w:t>independientes para facilitar su lectura.</w:t>
+      </w:r>
+    </w:p>
+    <w:p>
+      <w:r>
+        <w:t>La Figura 10-6 presenta en tamaño ampliado la vista general de casos de uso del sistema.</w:t>
+      </w:r>
+    </w:p>
+    <w:p>
+      <w:pPr>
+        <w:jc w:val="center"/>
+      </w:pPr>
+      <w:r>
+        <w:rPr>
+          <w:noProof/>
+        </w:rPr>
+        <w:drawing>
+          <wp:inline distT="0" distB="0" distL="0" distR="0" wp14:anchorId="633226CE" wp14:editId="1607A626">
+            <wp:extent cx="6035040" cy="6284821"/>
+            <wp:effectExtent l="0" t="0" r="0" b="0"/>
+            <wp:docPr id="22" name="Picture 22"/>
+            <wp:cNvGraphicFramePr>
+              <a:graphicFrameLocks xmlns:a="http://schemas.openxmlformats.org/drawingml/2006/main" noChangeAspect="1"/>
+            </wp:cNvGraphicFramePr>
+            <a:graphic xmlns:a="http://schemas.openxmlformats.org/drawingml/2006/main">
+              <a:graphicData uri="http://schemas.openxmlformats.org/drawingml/2006/picture">
+                <pic:pic xmlns:pic="http://schemas.openxmlformats.org/drawingml/2006/picture">
+                  <pic:nvPicPr>
+                    <pic:cNvPr id="0" name="06_casos_uso_general.png"/>
+                    <pic:cNvPicPr/>
+                  </pic:nvPicPr>
+                  <pic:blipFill>
+                    <a:blip r:embed="rId29"/>
+                    <a:stretch>
+                      <a:fillRect/>
+                    </a:stretch>
+                  </pic:blipFill>
+                  <pic:spPr>
+                    <a:xfrm>
+                      <a:off x="0" y="0"/>
+                      <a:ext cx="6035040" cy="6284821"/>
+                    </a:xfrm>
+                    <a:prstGeom prst="rect">
+                      <a:avLst/>
+                    </a:prstGeom>
+                  </pic:spPr>
+                </pic:pic>
+              </a:graphicData>
+            </a:graphic>
+          </wp:inline>
+        </w:drawing>
+      </w:r>
+    </w:p>
+    <w:p>
+      <w:pPr>
+        <w:pStyle w:val="Descripcin"/>
+      </w:pPr>
+      <w:r>
+        <w:t>Figura 10-6. Diagrama de casos de uso general ampliado.</w:t>
+      </w:r>
+    </w:p>
+    <w:p>
+      <w:r>
+        <w:lastRenderedPageBreak/>
+        <w:br w:type="page"/>
+      </w:r>
+    </w:p>
+    <w:p>
+      <w:r>
+        <w:lastRenderedPageBreak/>
+        <w:t>La Figura 10-7 presenta en tamaño ampliado los casos de uso del m</w:t>
+      </w:r>
+      <w:r>
+        <w:t>ódulo de jugadores.</w:t>
+      </w:r>
+    </w:p>
+    <w:p>
+      <w:pPr>
+        <w:jc w:val="center"/>
+      </w:pPr>
+      <w:r>
+        <w:rPr>
+          <w:noProof/>
+        </w:rPr>
+        <w:lastRenderedPageBreak/>
+        <w:drawing>
+          <wp:inline distT="0" distB="0" distL="0" distR="0" wp14:anchorId="3E7DB634" wp14:editId="77C3BDC8">
+            <wp:extent cx="4251960" cy="8075933"/>
+            <wp:effectExtent l="0" t="0" r="0" b="0"/>
+            <wp:docPr id="23" name="Picture 23"/>
+            <wp:cNvGraphicFramePr>
+              <a:graphicFrameLocks xmlns:a="http://schemas.openxmlformats.org/drawingml/2006/main" noChangeAspect="1"/>
+            </wp:cNvGraphicFramePr>
+            <a:graphic xmlns:a="http://schemas.openxmlformats.org/drawingml/2006/main">
+              <a:graphicData uri="http://schemas.openxmlformats.org/drawingml/2006/picture">
+                <pic:pic xmlns:pic="http://schemas.openxmlformats.org/drawingml/2006/picture">
+                  <pic:nvPicPr>
+                    <pic:cNvPr id="0" name="07_casos_uso_gestion_jugadores.png"/>
+                    <pic:cNvPicPr/>
+                  </pic:nvPicPr>
+                  <pic:blipFill>
+                    <a:blip r:embed="rId30"/>
+                    <a:stretch>
+                      <a:fillRect/>
+                    </a:stretch>
+                  </pic:blipFill>
+                  <pic:spPr>
+                    <a:xfrm>
+                      <a:off x="0" y="0"/>
+                      <a:ext cx="4251960" cy="8075933"/>
+                    </a:xfrm>
+                    <a:prstGeom prst="rect">
+                      <a:avLst/>
+                    </a:prstGeom>
+                  </pic:spPr>
+                </pic:pic>
+              </a:graphicData>
+            </a:graphic>
+          </wp:inline>
+        </w:drawing>
+      </w:r>
+    </w:p>
+    <w:p>
+      <w:pPr>
+        <w:pStyle w:val="Descripcin"/>
+      </w:pPr>
+      <w:r>
+        <w:lastRenderedPageBreak/>
+        <w:t>Figura 10-7. Diagrama de casos de uso de gestión de jugadores ampliado.</w:t>
+      </w:r>
+    </w:p>
+    <w:p>
+      <w:r>
+        <w:br w:type="page"/>
+      </w:r>
+    </w:p>
+    <w:p>
+      <w:r>
+        <w:lastRenderedPageBreak/>
+        <w:t>La Figura 10-8 presenta en tamaño ampliado los casos de uso de análisis, comparación y predicción.</w:t>
+      </w:r>
+    </w:p>
+    <w:p>
+      <w:pPr>
+        <w:jc w:val="center"/>
+      </w:pPr>
+      <w:r>
+        <w:rPr>
+          <w:noProof/>
+        </w:rPr>
+        <w:drawing>
+          <wp:inline distT="0" distB="0" distL="0" distR="0" wp14:anchorId="2B549A24" wp14:editId="67AA33EA">
+            <wp:extent cx="6309360" cy="4441457"/>
+            <wp:effectExtent l="0" t="0" r="0" b="0"/>
+            <wp:docPr id="24" name="Picture 24"/>
+            <wp:cNvGraphicFramePr>
+              <a:graphicFrameLocks xmlns:a="http://schemas.openxmlformats.org/drawingml/2006/main" noChangeAspect="1"/>
+            </wp:cNvGraphicFramePr>
+            <a:graphic xmlns:a="http://schemas.openxmlformats.org/drawingml/2006/main">
+              <a:graphicData uri="http://schemas.openxmlformats.org/drawingml/2006/picture">
+                <pic:pic xmlns:pic="http://schemas.openxmlformats.org/drawingml/2006/picture">
+                  <pic:nvPicPr>
+                    <pic:cNvPr id="0" name="08_casos_uso_analisis_decision.png"/>
+                    <pic:cNvPicPr/>
+                  </pic:nvPicPr>
+                  <pic:blipFill>
+                    <a:blip r:embed="rId31"/>
+                    <a:stretch>
+                      <a:fillRect/>
+                    </a:stretch>
+                  </pic:blipFill>
+                  <pic:spPr>
+                    <a:xfrm>
+                      <a:off x="0" y="0"/>
+                      <a:ext cx="6309360" cy="4441457"/>
+                    </a:xfrm>
+                    <a:prstGeom prst="rect">
+                      <a:avLst/>
+                    </a:prstGeom>
+                  </pic:spPr>
+                </pic:pic>
+              </a:graphicData>
+            </a:graphic>
+          </wp:inline>
+        </w:drawing>
+      </w:r>
+    </w:p>
+    <w:p>
+      <w:pPr>
+        <w:pStyle w:val="Descripcin"/>
+      </w:pPr>
+      <w:r>
+        <w:t>Figura 10-8. Diagrama de casos de uso de análisis y decisió</w:t>
+      </w:r>
+      <w:r>
+        <w:t>n scout ampliado.</w:t>
+      </w:r>
+    </w:p>
     <w:sectPr>
-      <w:headerReference w:type="default" r:id="rId52"/>
-      <w:footerReference w:type="even" r:id="rId53"/>
-      <w:footerReference w:type="default" r:id="rId54"/>
-      <w:footerReference w:type="first" r:id="rId55"/>
+      <w:headerReference w:type="default" r:id="rId60"/>
+      <w:footerReference w:type="even" r:id="rId61"/>
+      <w:footerReference w:type="default" r:id="rId62"/>
+      <w:footerReference w:type="first" r:id="rId63"/>
       <w:pgSz w:w="12240" w:h="15840"/>
       <w:pgMar w:top="1417" w:right="1701" w:bottom="1417" w:left="1701" w:header="708" w:footer="708" w:gutter="0"/>
       <w:cols w:space="708"/>

</xml_diff>